<commit_message>
SPs & Rest APIs V3: Open Items
</commit_message>
<xml_diff>
--- a/VetsPorVzla - Pendientes de Integración.docx
+++ b/VetsPorVzla - Pendientes de Integración.docx
@@ -5,52 +5,118 @@
     <w:p>
       <w:pPr>
         <w:pStyle w:val="Heading1"/>
+        <w:rPr>
+          <w:lang w:val="es-VE"/>
+        </w:rPr>
       </w:pPr>
       <w:bookmarkStart w:id="0" w:name="X4aff03c50e34ff405e1af94316f09a8b95563fb"/>
-      <w:r>
-        <w:t>VetsPorVzla — Pendientes para continuar integración FE + Prototype + BD</w:t>
+      <w:proofErr w:type="spellStart"/>
+      <w:r>
+        <w:rPr>
+          <w:lang w:val="es-VE"/>
+        </w:rPr>
+        <w:t>VetsPorVzla</w:t>
+      </w:r>
+      <w:proofErr w:type="spellEnd"/>
+      <w:r>
+        <w:rPr>
+          <w:lang w:val="es-VE"/>
+        </w:rPr>
+        <w:t xml:space="preserve"> — Pendientes para continuar integración FE + </w:t>
+      </w:r>
+      <w:proofErr w:type="spellStart"/>
+      <w:r>
+        <w:rPr>
+          <w:lang w:val="es-VE"/>
+        </w:rPr>
+        <w:t>Prototype</w:t>
+      </w:r>
+      <w:proofErr w:type="spellEnd"/>
+      <w:r>
+        <w:rPr>
+          <w:lang w:val="es-VE"/>
+        </w:rPr>
+        <w:t xml:space="preserve"> + BD</w:t>
       </w:r>
     </w:p>
     <w:p>
       <w:pPr>
         <w:pStyle w:val="FirstParagraph"/>
-      </w:pPr>
-      <w:r>
+        <w:rPr>
+          <w:lang w:val="es-VE"/>
+        </w:rPr>
+      </w:pPr>
+      <w:r>
+        <w:rPr>
+          <w:lang w:val="es-VE"/>
+        </w:rPr>
         <w:t>Hola,</w:t>
       </w:r>
     </w:p>
     <w:p>
       <w:pPr>
         <w:pStyle w:val="BodyText"/>
-      </w:pPr>
-      <w:r>
+        <w:rPr>
+          <w:lang w:val="es-VE"/>
+        </w:rPr>
+      </w:pPr>
+      <w:r>
+        <w:rPr>
+          <w:lang w:val="es-VE"/>
+        </w:rPr>
         <w:t xml:space="preserve">Te comparto el contexto actual del proyecto </w:t>
       </w:r>
+      <w:proofErr w:type="spellStart"/>
       <w:r>
         <w:rPr>
           <w:b/>
           <w:bCs/>
-        </w:rPr>
-        <w:t>VetsPorVzla / Veterinarios por Venezuela</w:t>
-      </w:r>
-      <w:r>
+          <w:lang w:val="es-VE"/>
+        </w:rPr>
+        <w:t>VetsPorVzla</w:t>
+      </w:r>
+      <w:proofErr w:type="spellEnd"/>
+      <w:r>
+        <w:rPr>
+          <w:b/>
+          <w:bCs/>
+          <w:lang w:val="es-VE"/>
+        </w:rPr>
+        <w:t xml:space="preserve"> / Veterinarios por Venezuela</w:t>
+      </w:r>
+      <w:r>
+        <w:rPr>
+          <w:lang w:val="es-VE"/>
+        </w:rPr>
         <w:t xml:space="preserve"> y el trabajo pendiente para continuar el desarrollo.</w:t>
       </w:r>
     </w:p>
     <w:p>
       <w:pPr>
         <w:pStyle w:val="Heading2"/>
+        <w:rPr>
+          <w:lang w:val="es-VE"/>
+        </w:rPr>
       </w:pPr>
       <w:bookmarkStart w:id="1" w:name="repositorios"/>
       <w:r>
+        <w:rPr>
+          <w:lang w:val="es-VE"/>
+        </w:rPr>
         <w:t>1. Repositorios</w:t>
       </w:r>
     </w:p>
     <w:p>
       <w:pPr>
         <w:pStyle w:val="FirstParagraph"/>
-      </w:pPr>
-      <w:r>
+        <w:rPr>
+          <w:lang w:val="es-VE"/>
+        </w:rPr>
+      </w:pPr>
+      <w:r>
+        <w:rPr>
+          <w:lang w:val="es-VE"/>
+        </w:rPr>
         <w:t>Tenemos dos repositorios relacionados:</w:t>
       </w:r>
     </w:p>
@@ -61,11 +127,20 @@
           <w:ilvl w:val="0"/>
           <w:numId w:val="2"/>
         </w:numPr>
-      </w:pPr>
-      <w:r>
+        <w:rPr>
+          <w:lang w:val="es-VE"/>
+        </w:rPr>
+      </w:pPr>
+      <w:r>
+        <w:rPr>
+          <w:lang w:val="es-VE"/>
+        </w:rPr>
         <w:t>https://github.com/lidmartins/VetsPorVzla/tree/main</w:t>
       </w:r>
       <w:r>
+        <w:rPr>
+          <w:lang w:val="es-VE"/>
+        </w:rPr>
         <w:br/>
       </w:r>
     </w:p>
@@ -84,43 +159,70 @@
     <w:p>
       <w:pPr>
         <w:pStyle w:val="FirstParagraph"/>
-      </w:pPr>
-      <w:r>
+        <w:rPr>
+          <w:lang w:val="es-VE"/>
+        </w:rPr>
+      </w:pPr>
+      <w:r>
+        <w:rPr>
+          <w:lang w:val="es-VE"/>
+        </w:rPr>
         <w:t>El repo principal de trabajo es:</w:t>
       </w:r>
     </w:p>
     <w:p>
       <w:pPr>
         <w:pStyle w:val="SourceCode"/>
-      </w:pPr>
-      <w:r>
-        <w:rPr>
-          <w:rStyle w:val="VerbatimChar"/>
+        <w:rPr>
+          <w:lang w:val="es-VE"/>
+        </w:rPr>
+      </w:pPr>
+      <w:proofErr w:type="spellStart"/>
+      <w:r>
+        <w:rPr>
+          <w:rStyle w:val="VerbatimChar"/>
+          <w:lang w:val="es-VE"/>
         </w:rPr>
         <w:t>VetsPorVzla</w:t>
       </w:r>
+      <w:proofErr w:type="spellEnd"/>
     </w:p>
     <w:p>
       <w:pPr>
         <w:pStyle w:val="Heading2"/>
+        <w:rPr>
+          <w:lang w:val="es-VE"/>
+        </w:rPr>
       </w:pPr>
       <w:bookmarkStart w:id="2" w:name="estructura-actual-del-repo-vetsporvzla"/>
       <w:bookmarkEnd w:id="1"/>
       <w:r>
+        <w:rPr>
+          <w:lang w:val="es-VE"/>
+        </w:rPr>
         <w:t xml:space="preserve">2. Estructura actual del repo </w:t>
       </w:r>
-      <w:r>
-        <w:rPr>
-          <w:rStyle w:val="VerbatimChar"/>
+      <w:proofErr w:type="spellStart"/>
+      <w:r>
+        <w:rPr>
+          <w:rStyle w:val="VerbatimChar"/>
+          <w:lang w:val="es-VE"/>
         </w:rPr>
         <w:t>VetsPorVzla</w:t>
       </w:r>
+      <w:proofErr w:type="spellEnd"/>
     </w:p>
     <w:p>
       <w:pPr>
         <w:pStyle w:val="FirstParagraph"/>
-      </w:pPr>
-      <w:r>
+        <w:rPr>
+          <w:lang w:val="es-VE"/>
+        </w:rPr>
+      </w:pPr>
+      <w:r>
+        <w:rPr>
+          <w:lang w:val="es-VE"/>
+        </w:rPr>
         <w:t>Actualmente el repo contiene estas carpetas principales:</w:t>
       </w:r>
     </w:p>
@@ -129,12 +231,14 @@
         <w:pStyle w:val="Compact"/>
         <w:rPr>
           <w:rStyle w:val="VerbatimChar"/>
-        </w:rPr>
-      </w:pPr>
-      <w:proofErr w:type="spellStart"/>
-      <w:r>
-        <w:rPr>
-          <w:rStyle w:val="VerbatimChar"/>
+          <w:lang w:val="es-VE"/>
+        </w:rPr>
+      </w:pPr>
+      <w:proofErr w:type="spellStart"/>
+      <w:r>
+        <w:rPr>
+          <w:rStyle w:val="VerbatimChar"/>
+          <w:lang w:val="es-VE"/>
         </w:rPr>
         <w:t>VetsPorVzla</w:t>
       </w:r>
@@ -142,16 +246,21 @@
       <w:r>
         <w:rPr>
           <w:rStyle w:val="VerbatimChar"/>
+          <w:lang w:val="es-VE"/>
         </w:rPr>
         <w:t>/</w:t>
       </w:r>
       <w:r>
+        <w:rPr>
+          <w:lang w:val="es-VE"/>
+        </w:rPr>
         <w:br/>
       </w:r>
       <w:bookmarkStart w:id="3" w:name="analysisdesign"/>
       <w:r>
         <w:rPr>
           <w:rStyle w:val="VerbatimChar"/>
+          <w:lang w:val="es-VE"/>
         </w:rPr>
         <w:t xml:space="preserve">├── </w:t>
       </w:r>
@@ -159,6 +268,7 @@
       <w:r>
         <w:rPr>
           <w:rStyle w:val="VerbatimChar"/>
+          <w:lang w:val="es-VE"/>
         </w:rPr>
         <w:t>AnalysisDesign</w:t>
       </w:r>
@@ -166,6 +276,7 @@
       <w:r>
         <w:rPr>
           <w:rStyle w:val="VerbatimChar"/>
+          <w:lang w:val="es-VE"/>
         </w:rPr>
         <w:t>/</w:t>
       </w:r>
@@ -175,11 +286,13 @@
         <w:pStyle w:val="Compact"/>
         <w:rPr>
           <w:rStyle w:val="VerbatimChar"/>
-        </w:rPr>
-      </w:pPr>
-      <w:r>
-        <w:rPr>
-          <w:rStyle w:val="VerbatimChar"/>
+          <w:lang w:val="es-VE"/>
+        </w:rPr>
+      </w:pPr>
+      <w:r>
+        <w:rPr>
+          <w:rStyle w:val="VerbatimChar"/>
+          <w:lang w:val="es-VE"/>
         </w:rPr>
         <w:t>├── DB/</w:t>
       </w:r>
@@ -189,11 +302,13 @@
         <w:pStyle w:val="Compact"/>
         <w:rPr>
           <w:rStyle w:val="VerbatimChar"/>
-        </w:rPr>
-      </w:pPr>
-      <w:r>
-        <w:rPr>
-          <w:rStyle w:val="VerbatimChar"/>
+          <w:lang w:val="es-VE"/>
+        </w:rPr>
+      </w:pPr>
+      <w:r>
+        <w:rPr>
+          <w:rStyle w:val="VerbatimChar"/>
+          <w:lang w:val="es-VE"/>
         </w:rPr>
         <w:t>├── FE/</w:t>
       </w:r>
@@ -203,11 +318,13 @@
         <w:pStyle w:val="Compact"/>
         <w:rPr>
           <w:rStyle w:val="VerbatimChar"/>
-        </w:rPr>
-      </w:pPr>
-      <w:r>
-        <w:rPr>
-          <w:rStyle w:val="VerbatimChar"/>
+          <w:lang w:val="es-VE"/>
+        </w:rPr>
+      </w:pPr>
+      <w:r>
+        <w:rPr>
+          <w:rStyle w:val="VerbatimChar"/>
+          <w:lang w:val="es-VE"/>
         </w:rPr>
         <w:t>├── FE/</w:t>
       </w:r>
@@ -217,29 +334,61 @@
         <w:pStyle w:val="Compact"/>
         <w:rPr>
           <w:rStyle w:val="VerbatimChar"/>
-        </w:rPr>
-      </w:pPr>
-      <w:r>
-        <w:rPr>
-          <w:rStyle w:val="VerbatimChar"/>
-        </w:rPr>
-        <w:t>├   └── *.md</w:t>
-      </w:r>
+          <w:lang w:val="es-VE"/>
+        </w:rPr>
+      </w:pPr>
+      <w:r>
+        <w:rPr>
+          <w:rStyle w:val="VerbatimChar"/>
+          <w:lang w:val="es-VE"/>
+        </w:rPr>
+        <w:t>├   └── *.</w:t>
+      </w:r>
+      <w:proofErr w:type="spellStart"/>
+      <w:r>
+        <w:rPr>
+          <w:rStyle w:val="VerbatimChar"/>
+          <w:lang w:val="es-VE"/>
+        </w:rPr>
+        <w:t>md</w:t>
+      </w:r>
+      <w:proofErr w:type="spellEnd"/>
     </w:p>
     <w:p>
       <w:pPr>
         <w:pStyle w:val="Compact"/>
-      </w:pPr>
-      <w:r>
-        <w:rPr>
-          <w:rStyle w:val="VerbatimChar"/>
-        </w:rPr>
-        <w:t>└── Prototype/</w:t>
-      </w:r>
-      <w:proofErr w:type="spellStart"/>
-      <w:r>
-        <w:rPr>
-          <w:rStyle w:val="VerbatimChar"/>
+        <w:rPr>
+          <w:lang w:val="es-VE"/>
+        </w:rPr>
+      </w:pPr>
+      <w:r>
+        <w:rPr>
+          <w:rStyle w:val="VerbatimChar"/>
+          <w:lang w:val="es-VE"/>
+        </w:rPr>
+        <w:t xml:space="preserve">└── </w:t>
+      </w:r>
+      <w:proofErr w:type="spellStart"/>
+      <w:r>
+        <w:rPr>
+          <w:rStyle w:val="VerbatimChar"/>
+          <w:lang w:val="es-VE"/>
+        </w:rPr>
+        <w:t>Prototype</w:t>
+      </w:r>
+      <w:proofErr w:type="spellEnd"/>
+      <w:r>
+        <w:rPr>
+          <w:rStyle w:val="VerbatimChar"/>
+          <w:lang w:val="es-VE"/>
+        </w:rPr>
+        <w:t>/</w:t>
+      </w:r>
+      <w:proofErr w:type="spellStart"/>
+      <w:r>
+        <w:rPr>
+          <w:rStyle w:val="VerbatimChar"/>
+          <w:lang w:val="es-VE"/>
         </w:rPr>
         <w:t>AnalysisDesign</w:t>
       </w:r>
@@ -247,6 +396,7 @@
       <w:r>
         <w:rPr>
           <w:rStyle w:val="VerbatimChar"/>
+          <w:lang w:val="es-VE"/>
         </w:rPr>
         <w:t>/</w:t>
       </w:r>
@@ -254,48 +404,83 @@
     <w:p>
       <w:pPr>
         <w:pStyle w:val="FirstParagraph"/>
-      </w:pPr>
-      <w:r>
+        <w:rPr>
+          <w:lang w:val="es-VE"/>
+        </w:rPr>
+      </w:pPr>
+      <w:r>
+        <w:rPr>
+          <w:lang w:val="es-VE"/>
+        </w:rPr>
         <w:t>Contiene documentación de análisis y diseño, incluyendo:</w:t>
       </w:r>
     </w:p>
     <w:p>
       <w:pPr>
         <w:pStyle w:val="SourceCode"/>
-      </w:pPr>
-      <w:r>
-        <w:rPr>
-          <w:rStyle w:val="VerbatimChar"/>
-        </w:rPr>
-        <w:t>ER Diagram</w:t>
-      </w:r>
-      <w:r>
-        <w:br/>
-      </w:r>
-      <w:r>
-        <w:rPr>
-          <w:rStyle w:val="VerbatimChar"/>
+        <w:rPr>
+          <w:lang w:val="es-VE"/>
+        </w:rPr>
+      </w:pPr>
+      <w:r>
+        <w:rPr>
+          <w:rStyle w:val="VerbatimChar"/>
+          <w:lang w:val="es-VE"/>
+        </w:rPr>
+        <w:t xml:space="preserve">ER </w:t>
+      </w:r>
+      <w:proofErr w:type="spellStart"/>
+      <w:r>
+        <w:rPr>
+          <w:rStyle w:val="VerbatimChar"/>
+          <w:lang w:val="es-VE"/>
+        </w:rPr>
+        <w:t>Diagram</w:t>
+      </w:r>
+      <w:proofErr w:type="spellEnd"/>
+      <w:r>
+        <w:rPr>
+          <w:lang w:val="es-VE"/>
+        </w:rPr>
+        <w:br/>
+      </w:r>
+      <w:proofErr w:type="spellStart"/>
+      <w:r>
+        <w:rPr>
+          <w:rStyle w:val="VerbatimChar"/>
+          <w:lang w:val="es-VE"/>
         </w:rPr>
         <w:t>Architecture</w:t>
       </w:r>
+      <w:proofErr w:type="spellEnd"/>
     </w:p>
     <w:p>
       <w:pPr>
         <w:pStyle w:val="FirstParagraph"/>
-      </w:pPr>
-      <w:r>
+        <w:rPr>
+          <w:lang w:val="es-VE"/>
+        </w:rPr>
+      </w:pPr>
+      <w:r>
+        <w:rPr>
+          <w:lang w:val="es-VE"/>
+        </w:rPr>
         <w:t>Aquí está el modelo ER actualizado del sistema.</w:t>
       </w:r>
     </w:p>
     <w:p>
       <w:pPr>
         <w:pStyle w:val="Heading3"/>
+        <w:rPr>
+          <w:lang w:val="es-VE"/>
+        </w:rPr>
       </w:pPr>
       <w:bookmarkStart w:id="4" w:name="db"/>
       <w:bookmarkEnd w:id="3"/>
       <w:r>
         <w:rPr>
           <w:rStyle w:val="VerbatimChar"/>
+          <w:lang w:val="es-VE"/>
         </w:rPr>
         <w:t>DB/</w:t>
       </w:r>
@@ -303,39 +488,82 @@
     <w:p>
       <w:pPr>
         <w:pStyle w:val="FirstParagraph"/>
-      </w:pPr>
-      <w:r>
+        <w:rPr>
+          <w:lang w:val="es-VE"/>
+        </w:rPr>
+      </w:pPr>
+      <w:r>
+        <w:rPr>
+          <w:lang w:val="es-VE"/>
+        </w:rPr>
         <w:t>Contiene el script de base de datos listo para ejecutar:</w:t>
       </w:r>
     </w:p>
     <w:p>
       <w:pPr>
         <w:pStyle w:val="SourceCode"/>
-      </w:pPr>
-      <w:r>
-        <w:rPr>
-          <w:rStyle w:val="VerbatimChar"/>
-        </w:rPr>
-        <w:t>DB/veterinarios_venezuela_db.sql</w:t>
-      </w:r>
+        <w:rPr>
+          <w:lang w:val="es-VE"/>
+        </w:rPr>
+      </w:pPr>
+      <w:r>
+        <w:rPr>
+          <w:rStyle w:val="VerbatimChar"/>
+          <w:lang w:val="es-VE"/>
+        </w:rPr>
+        <w:t>DB/</w:t>
+      </w:r>
+      <w:proofErr w:type="spellStart"/>
+      <w:r>
+        <w:rPr>
+          <w:rStyle w:val="VerbatimChar"/>
+          <w:lang w:val="es-VE"/>
+        </w:rPr>
+        <w:t>veterinarios_venezuela_db.sql</w:t>
+      </w:r>
+      <w:proofErr w:type="spellEnd"/>
     </w:p>
     <w:p>
       <w:pPr>
         <w:pStyle w:val="FirstParagraph"/>
-      </w:pPr>
-      <w:r>
-        <w:t>Este script ya contiene las tablas/entities definidas para el sistema.</w:t>
+        <w:rPr>
+          <w:lang w:val="es-VE"/>
+        </w:rPr>
+      </w:pPr>
+      <w:r>
+        <w:rPr>
+          <w:lang w:val="es-VE"/>
+        </w:rPr>
+        <w:t>Este script ya contiene las tablas/</w:t>
+      </w:r>
+      <w:proofErr w:type="spellStart"/>
+      <w:r>
+        <w:rPr>
+          <w:lang w:val="es-VE"/>
+        </w:rPr>
+        <w:t>entities</w:t>
+      </w:r>
+      <w:proofErr w:type="spellEnd"/>
+      <w:r>
+        <w:rPr>
+          <w:lang w:val="es-VE"/>
+        </w:rPr>
+        <w:t xml:space="preserve"> definidas para el sistema.</w:t>
       </w:r>
     </w:p>
     <w:p>
       <w:pPr>
         <w:pStyle w:val="Heading3"/>
+        <w:rPr>
+          <w:lang w:val="es-VE"/>
+        </w:rPr>
       </w:pPr>
       <w:bookmarkStart w:id="5" w:name="fe"/>
       <w:bookmarkEnd w:id="4"/>
       <w:r>
         <w:rPr>
           <w:rStyle w:val="VerbatimChar"/>
+          <w:lang w:val="es-VE"/>
         </w:rPr>
         <w:lastRenderedPageBreak/>
         <w:t>FE/</w:t>
@@ -344,381 +572,882 @@
     <w:p>
       <w:pPr>
         <w:pStyle w:val="FirstParagraph"/>
-      </w:pPr>
-      <w:r>
+        <w:rPr>
+          <w:lang w:val="es-VE"/>
+        </w:rPr>
+      </w:pPr>
+      <w:r>
+        <w:rPr>
+          <w:lang w:val="es-VE"/>
+        </w:rPr>
         <w:t>Contiene el proyecto Angular creado con el nombre:</w:t>
       </w:r>
     </w:p>
     <w:p>
       <w:pPr>
         <w:pStyle w:val="SourceCode"/>
-      </w:pPr>
-      <w:r>
-        <w:rPr>
-          <w:rStyle w:val="VerbatimChar"/>
+        <w:rPr>
+          <w:lang w:val="es-VE"/>
+        </w:rPr>
+      </w:pPr>
+      <w:proofErr w:type="spellStart"/>
+      <w:r>
+        <w:rPr>
+          <w:rStyle w:val="VerbatimChar"/>
+          <w:lang w:val="es-VE"/>
         </w:rPr>
         <w:t>vetsporvzla</w:t>
       </w:r>
+      <w:proofErr w:type="spellEnd"/>
     </w:p>
     <w:p>
       <w:pPr>
         <w:pStyle w:val="FirstParagraph"/>
-      </w:pPr>
-      <w:r>
-        <w:t>El scaffold existe, pero los componentes todavía están vacíos o con contenido básico.</w:t>
+        <w:rPr>
+          <w:lang w:val="es-VE"/>
+        </w:rPr>
+      </w:pPr>
+      <w:r>
+        <w:rPr>
+          <w:lang w:val="es-VE"/>
+        </w:rPr>
+        <w:t xml:space="preserve">El </w:t>
+      </w:r>
+      <w:proofErr w:type="spellStart"/>
+      <w:r>
+        <w:rPr>
+          <w:lang w:val="es-VE"/>
+        </w:rPr>
+        <w:t>scaffold</w:t>
+      </w:r>
+      <w:proofErr w:type="spellEnd"/>
+      <w:r>
+        <w:rPr>
+          <w:lang w:val="es-VE"/>
+        </w:rPr>
+        <w:t xml:space="preserve"> existe, pero los componentes todavía están vacíos o con contenido básico.</w:t>
       </w:r>
     </w:p>
     <w:p>
       <w:pPr>
         <w:pStyle w:val="BodyText"/>
-      </w:pPr>
-      <w:r>
+        <w:rPr>
+          <w:lang w:val="es-VE"/>
+        </w:rPr>
+      </w:pPr>
+      <w:r>
+        <w:rPr>
+          <w:lang w:val="es-VE"/>
+        </w:rPr>
         <w:t>Ya se avanzó con:</w:t>
       </w:r>
     </w:p>
     <w:p>
       <w:pPr>
         <w:pStyle w:val="SourceCode"/>
-      </w:pPr>
-      <w:r>
-        <w:rPr>
-          <w:rStyle w:val="VerbatimChar"/>
+        <w:rPr>
+          <w:lang w:val="es-VE"/>
+        </w:rPr>
+      </w:pPr>
+      <w:r>
+        <w:rPr>
+          <w:rStyle w:val="VerbatimChar"/>
+          <w:lang w:val="es-VE"/>
         </w:rPr>
         <w:t>1. Copiar los SCSS — Listo</w:t>
       </w:r>
       <w:r>
-        <w:br/>
-      </w:r>
-      <w:r>
-        <w:rPr>
-          <w:rStyle w:val="VerbatimChar"/>
-        </w:rPr>
-        <w:t>2. Llenar app.routes.ts copiando el routing del MD — Listo</w:t>
-      </w:r>
-      <w:r>
-        <w:br/>
-      </w:r>
-      <w:r>
-        <w:rPr>
-          <w:rStyle w:val="VerbatimChar"/>
-        </w:rPr>
-        <w:t>3. Crear los archivos de modelos en src/app/shared/models/ — Listo</w:t>
-      </w:r>
-      <w:r>
-        <w:br/>
-      </w:r>
-      <w:r>
-        <w:rPr>
-          <w:rStyle w:val="VerbatimChar"/>
-        </w:rPr>
-        <w:t>4. Crear src/environments/ — Listo</w:t>
+        <w:rPr>
+          <w:lang w:val="es-VE"/>
+        </w:rPr>
+        <w:br/>
+      </w:r>
+      <w:r>
+        <w:rPr>
+          <w:rStyle w:val="VerbatimChar"/>
+          <w:lang w:val="es-VE"/>
+        </w:rPr>
+        <w:t xml:space="preserve">2. Llenar </w:t>
+      </w:r>
+      <w:proofErr w:type="spellStart"/>
+      <w:proofErr w:type="gramStart"/>
+      <w:r>
+        <w:rPr>
+          <w:rStyle w:val="VerbatimChar"/>
+          <w:lang w:val="es-VE"/>
+        </w:rPr>
+        <w:t>app.routes</w:t>
+      </w:r>
+      <w:proofErr w:type="gramEnd"/>
+      <w:r>
+        <w:rPr>
+          <w:rStyle w:val="VerbatimChar"/>
+          <w:lang w:val="es-VE"/>
+        </w:rPr>
+        <w:t>.ts</w:t>
+      </w:r>
+      <w:proofErr w:type="spellEnd"/>
+      <w:r>
+        <w:rPr>
+          <w:rStyle w:val="VerbatimChar"/>
+          <w:lang w:val="es-VE"/>
+        </w:rPr>
+        <w:t xml:space="preserve"> copiando el </w:t>
+      </w:r>
+      <w:proofErr w:type="spellStart"/>
+      <w:r>
+        <w:rPr>
+          <w:rStyle w:val="VerbatimChar"/>
+          <w:lang w:val="es-VE"/>
+        </w:rPr>
+        <w:t>routing</w:t>
+      </w:r>
+      <w:proofErr w:type="spellEnd"/>
+      <w:r>
+        <w:rPr>
+          <w:rStyle w:val="VerbatimChar"/>
+          <w:lang w:val="es-VE"/>
+        </w:rPr>
+        <w:t xml:space="preserve"> del MD — Listo</w:t>
+      </w:r>
+      <w:r>
+        <w:rPr>
+          <w:lang w:val="es-VE"/>
+        </w:rPr>
+        <w:br/>
+      </w:r>
+      <w:r>
+        <w:rPr>
+          <w:rStyle w:val="VerbatimChar"/>
+          <w:lang w:val="es-VE"/>
+        </w:rPr>
+        <w:t xml:space="preserve">3. Crear los archivos de modelos en </w:t>
+      </w:r>
+      <w:proofErr w:type="spellStart"/>
+      <w:r>
+        <w:rPr>
+          <w:rStyle w:val="VerbatimChar"/>
+          <w:lang w:val="es-VE"/>
+        </w:rPr>
+        <w:t>src</w:t>
+      </w:r>
+      <w:proofErr w:type="spellEnd"/>
+      <w:r>
+        <w:rPr>
+          <w:rStyle w:val="VerbatimChar"/>
+          <w:lang w:val="es-VE"/>
+        </w:rPr>
+        <w:t>/</w:t>
+      </w:r>
+      <w:proofErr w:type="gramStart"/>
+      <w:r>
+        <w:rPr>
+          <w:rStyle w:val="VerbatimChar"/>
+          <w:lang w:val="es-VE"/>
+        </w:rPr>
+        <w:t>app</w:t>
+      </w:r>
+      <w:proofErr w:type="gramEnd"/>
+      <w:r>
+        <w:rPr>
+          <w:rStyle w:val="VerbatimChar"/>
+          <w:lang w:val="es-VE"/>
+        </w:rPr>
+        <w:t>/</w:t>
+      </w:r>
+      <w:proofErr w:type="spellStart"/>
+      <w:r>
+        <w:rPr>
+          <w:rStyle w:val="VerbatimChar"/>
+          <w:lang w:val="es-VE"/>
+        </w:rPr>
+        <w:t>shared</w:t>
+      </w:r>
+      <w:proofErr w:type="spellEnd"/>
+      <w:r>
+        <w:rPr>
+          <w:rStyle w:val="VerbatimChar"/>
+          <w:lang w:val="es-VE"/>
+        </w:rPr>
+        <w:t>/</w:t>
+      </w:r>
+      <w:proofErr w:type="spellStart"/>
+      <w:r>
+        <w:rPr>
+          <w:rStyle w:val="VerbatimChar"/>
+          <w:lang w:val="es-VE"/>
+        </w:rPr>
+        <w:t>models</w:t>
+      </w:r>
+      <w:proofErr w:type="spellEnd"/>
+      <w:r>
+        <w:rPr>
+          <w:rStyle w:val="VerbatimChar"/>
+          <w:lang w:val="es-VE"/>
+        </w:rPr>
+        <w:t>/ — Listo</w:t>
+      </w:r>
+      <w:r>
+        <w:rPr>
+          <w:lang w:val="es-VE"/>
+        </w:rPr>
+        <w:br/>
+      </w:r>
+      <w:r>
+        <w:rPr>
+          <w:rStyle w:val="VerbatimChar"/>
+          <w:lang w:val="es-VE"/>
+        </w:rPr>
+        <w:t xml:space="preserve">4. Crear </w:t>
+      </w:r>
+      <w:proofErr w:type="spellStart"/>
+      <w:r>
+        <w:rPr>
+          <w:rStyle w:val="VerbatimChar"/>
+          <w:lang w:val="es-VE"/>
+        </w:rPr>
+        <w:t>src</w:t>
+      </w:r>
+      <w:proofErr w:type="spellEnd"/>
+      <w:r>
+        <w:rPr>
+          <w:rStyle w:val="VerbatimChar"/>
+          <w:lang w:val="es-VE"/>
+        </w:rPr>
+        <w:t>/</w:t>
+      </w:r>
+      <w:proofErr w:type="spellStart"/>
+      <w:r>
+        <w:rPr>
+          <w:rStyle w:val="VerbatimChar"/>
+          <w:lang w:val="es-VE"/>
+        </w:rPr>
+        <w:t>environments</w:t>
+      </w:r>
+      <w:proofErr w:type="spellEnd"/>
+      <w:r>
+        <w:rPr>
+          <w:rStyle w:val="VerbatimChar"/>
+          <w:lang w:val="es-VE"/>
+        </w:rPr>
+        <w:t>/ — Listo</w:t>
       </w:r>
     </w:p>
     <w:p>
       <w:pPr>
         <w:pStyle w:val="FirstParagraph"/>
-      </w:pPr>
-      <w:r>
+        <w:rPr>
+          <w:lang w:val="es-VE"/>
+        </w:rPr>
+      </w:pPr>
+      <w:r>
+        <w:rPr>
+          <w:lang w:val="es-VE"/>
+        </w:rPr>
         <w:t>Modelos ya creados:</w:t>
       </w:r>
     </w:p>
     <w:p>
       <w:pPr>
         <w:pStyle w:val="SourceCode"/>
-      </w:pPr>
-      <w:r>
-        <w:rPr>
-          <w:rStyle w:val="VerbatimChar"/>
-        </w:rPr>
-        <w:t>animal.model.ts</w:t>
-      </w:r>
-      <w:r>
-        <w:br/>
-      </w:r>
-      <w:r>
-        <w:rPr>
-          <w:rStyle w:val="VerbatimChar"/>
-        </w:rPr>
-        <w:t>solicitud.model.ts</w:t>
-      </w:r>
-      <w:r>
-        <w:br/>
-      </w:r>
-      <w:r>
-        <w:rPr>
-          <w:rStyle w:val="VerbatimChar"/>
-        </w:rPr>
-        <w:t>refugio.model.ts</w:t>
-      </w:r>
-      <w:r>
-        <w:br/>
-      </w:r>
-      <w:r>
-        <w:rPr>
-          <w:rStyle w:val="VerbatimChar"/>
-        </w:rPr>
-        <w:t>contacto.model.ts</w:t>
-      </w:r>
-      <w:r>
-        <w:br/>
-      </w:r>
-      <w:r>
-        <w:rPr>
-          <w:rStyle w:val="VerbatimChar"/>
-        </w:rPr>
-        <w:t>ubicacion.model.ts</w:t>
-      </w:r>
-      <w:r>
-        <w:br/>
-      </w:r>
-      <w:r>
-        <w:rPr>
-          <w:rStyle w:val="VerbatimChar"/>
-        </w:rPr>
-        <w:t>estado.model.ts</w:t>
-      </w:r>
-      <w:r>
-        <w:br/>
-      </w:r>
-      <w:r>
-        <w:rPr>
-          <w:rStyle w:val="VerbatimChar"/>
-        </w:rPr>
-        <w:t>user.model.ts</w:t>
-      </w:r>
-      <w:r>
-        <w:br/>
-      </w:r>
-      <w:r>
-        <w:rPr>
-          <w:rStyle w:val="VerbatimChar"/>
-        </w:rPr>
-        <w:t>role.model.ts</w:t>
-      </w:r>
-      <w:r>
-        <w:br/>
-      </w:r>
-      <w:r>
-        <w:rPr>
-          <w:rStyle w:val="VerbatimChar"/>
-        </w:rPr>
-        <w:t>revision-veterinaria.model.ts</w:t>
-      </w:r>
+        <w:rPr>
+          <w:lang w:val="es-VE"/>
+        </w:rPr>
+      </w:pPr>
+      <w:proofErr w:type="spellStart"/>
+      <w:proofErr w:type="gramStart"/>
+      <w:r>
+        <w:rPr>
+          <w:rStyle w:val="VerbatimChar"/>
+          <w:lang w:val="es-VE"/>
+        </w:rPr>
+        <w:t>animal.model</w:t>
+      </w:r>
+      <w:proofErr w:type="gramEnd"/>
+      <w:r>
+        <w:rPr>
+          <w:rStyle w:val="VerbatimChar"/>
+          <w:lang w:val="es-VE"/>
+        </w:rPr>
+        <w:t>.ts</w:t>
+      </w:r>
+      <w:proofErr w:type="spellEnd"/>
+      <w:r>
+        <w:rPr>
+          <w:lang w:val="es-VE"/>
+        </w:rPr>
+        <w:br/>
+      </w:r>
+      <w:proofErr w:type="spellStart"/>
+      <w:proofErr w:type="gramStart"/>
+      <w:r>
+        <w:rPr>
+          <w:rStyle w:val="VerbatimChar"/>
+          <w:lang w:val="es-VE"/>
+        </w:rPr>
+        <w:t>solicitud.model</w:t>
+      </w:r>
+      <w:proofErr w:type="gramEnd"/>
+      <w:r>
+        <w:rPr>
+          <w:rStyle w:val="VerbatimChar"/>
+          <w:lang w:val="es-VE"/>
+        </w:rPr>
+        <w:t>.ts</w:t>
+      </w:r>
+      <w:proofErr w:type="spellEnd"/>
+      <w:r>
+        <w:rPr>
+          <w:lang w:val="es-VE"/>
+        </w:rPr>
+        <w:br/>
+      </w:r>
+      <w:proofErr w:type="spellStart"/>
+      <w:proofErr w:type="gramStart"/>
+      <w:r>
+        <w:rPr>
+          <w:rStyle w:val="VerbatimChar"/>
+          <w:lang w:val="es-VE"/>
+        </w:rPr>
+        <w:t>refugio.model</w:t>
+      </w:r>
+      <w:proofErr w:type="gramEnd"/>
+      <w:r>
+        <w:rPr>
+          <w:rStyle w:val="VerbatimChar"/>
+          <w:lang w:val="es-VE"/>
+        </w:rPr>
+        <w:t>.ts</w:t>
+      </w:r>
+      <w:proofErr w:type="spellEnd"/>
+      <w:r>
+        <w:rPr>
+          <w:lang w:val="es-VE"/>
+        </w:rPr>
+        <w:br/>
+      </w:r>
+      <w:proofErr w:type="spellStart"/>
+      <w:proofErr w:type="gramStart"/>
+      <w:r>
+        <w:rPr>
+          <w:rStyle w:val="VerbatimChar"/>
+          <w:lang w:val="es-VE"/>
+        </w:rPr>
+        <w:t>contacto.model</w:t>
+      </w:r>
+      <w:proofErr w:type="gramEnd"/>
+      <w:r>
+        <w:rPr>
+          <w:rStyle w:val="VerbatimChar"/>
+          <w:lang w:val="es-VE"/>
+        </w:rPr>
+        <w:t>.ts</w:t>
+      </w:r>
+      <w:proofErr w:type="spellEnd"/>
+      <w:r>
+        <w:rPr>
+          <w:lang w:val="es-VE"/>
+        </w:rPr>
+        <w:br/>
+      </w:r>
+      <w:proofErr w:type="spellStart"/>
+      <w:proofErr w:type="gramStart"/>
+      <w:r>
+        <w:rPr>
+          <w:rStyle w:val="VerbatimChar"/>
+          <w:lang w:val="es-VE"/>
+        </w:rPr>
+        <w:t>ubicacion.model</w:t>
+      </w:r>
+      <w:proofErr w:type="gramEnd"/>
+      <w:r>
+        <w:rPr>
+          <w:rStyle w:val="VerbatimChar"/>
+          <w:lang w:val="es-VE"/>
+        </w:rPr>
+        <w:t>.ts</w:t>
+      </w:r>
+      <w:proofErr w:type="spellEnd"/>
+      <w:r>
+        <w:rPr>
+          <w:lang w:val="es-VE"/>
+        </w:rPr>
+        <w:br/>
+      </w:r>
+      <w:proofErr w:type="spellStart"/>
+      <w:proofErr w:type="gramStart"/>
+      <w:r>
+        <w:rPr>
+          <w:rStyle w:val="VerbatimChar"/>
+          <w:lang w:val="es-VE"/>
+        </w:rPr>
+        <w:t>estado.model</w:t>
+      </w:r>
+      <w:proofErr w:type="gramEnd"/>
+      <w:r>
+        <w:rPr>
+          <w:rStyle w:val="VerbatimChar"/>
+          <w:lang w:val="es-VE"/>
+        </w:rPr>
+        <w:t>.ts</w:t>
+      </w:r>
+      <w:proofErr w:type="spellEnd"/>
+      <w:r>
+        <w:rPr>
+          <w:lang w:val="es-VE"/>
+        </w:rPr>
+        <w:br/>
+      </w:r>
+      <w:proofErr w:type="spellStart"/>
+      <w:proofErr w:type="gramStart"/>
+      <w:r>
+        <w:rPr>
+          <w:rStyle w:val="VerbatimChar"/>
+          <w:lang w:val="es-VE"/>
+        </w:rPr>
+        <w:t>user.model</w:t>
+      </w:r>
+      <w:proofErr w:type="gramEnd"/>
+      <w:r>
+        <w:rPr>
+          <w:rStyle w:val="VerbatimChar"/>
+          <w:lang w:val="es-VE"/>
+        </w:rPr>
+        <w:t>.ts</w:t>
+      </w:r>
+      <w:proofErr w:type="spellEnd"/>
+      <w:r>
+        <w:rPr>
+          <w:lang w:val="es-VE"/>
+        </w:rPr>
+        <w:br/>
+      </w:r>
+      <w:proofErr w:type="spellStart"/>
+      <w:proofErr w:type="gramStart"/>
+      <w:r>
+        <w:rPr>
+          <w:rStyle w:val="VerbatimChar"/>
+          <w:lang w:val="es-VE"/>
+        </w:rPr>
+        <w:t>role.model</w:t>
+      </w:r>
+      <w:proofErr w:type="gramEnd"/>
+      <w:r>
+        <w:rPr>
+          <w:rStyle w:val="VerbatimChar"/>
+          <w:lang w:val="es-VE"/>
+        </w:rPr>
+        <w:t>.ts</w:t>
+      </w:r>
+      <w:proofErr w:type="spellEnd"/>
+      <w:r>
+        <w:rPr>
+          <w:lang w:val="es-VE"/>
+        </w:rPr>
+        <w:br/>
+      </w:r>
+      <w:proofErr w:type="spellStart"/>
+      <w:r>
+        <w:rPr>
+          <w:rStyle w:val="VerbatimChar"/>
+          <w:lang w:val="es-VE"/>
+        </w:rPr>
+        <w:t>revision-</w:t>
+      </w:r>
+      <w:proofErr w:type="gramStart"/>
+      <w:r>
+        <w:rPr>
+          <w:rStyle w:val="VerbatimChar"/>
+          <w:lang w:val="es-VE"/>
+        </w:rPr>
+        <w:t>veterinaria.model</w:t>
+      </w:r>
+      <w:proofErr w:type="gramEnd"/>
+      <w:r>
+        <w:rPr>
+          <w:rStyle w:val="VerbatimChar"/>
+          <w:lang w:val="es-VE"/>
+        </w:rPr>
+        <w:t>.ts</w:t>
+      </w:r>
+      <w:proofErr w:type="spellEnd"/>
     </w:p>
     <w:p>
       <w:pPr>
         <w:pStyle w:val="Heading3"/>
+        <w:rPr>
+          <w:lang w:val="es-VE"/>
+        </w:rPr>
       </w:pPr>
       <w:bookmarkStart w:id="6" w:name="prototype"/>
       <w:bookmarkEnd w:id="5"/>
-      <w:r>
-        <w:rPr>
-          <w:rStyle w:val="VerbatimChar"/>
-        </w:rPr>
-        <w:t>Prototype/</w:t>
+      <w:proofErr w:type="spellStart"/>
+      <w:r>
+        <w:rPr>
+          <w:rStyle w:val="VerbatimChar"/>
+          <w:lang w:val="es-VE"/>
+        </w:rPr>
+        <w:t>Prototype</w:t>
+      </w:r>
+      <w:proofErr w:type="spellEnd"/>
+      <w:r>
+        <w:rPr>
+          <w:rStyle w:val="VerbatimChar"/>
+          <w:lang w:val="es-VE"/>
+        </w:rPr>
+        <w:t>/</w:t>
       </w:r>
     </w:p>
     <w:p>
       <w:pPr>
         <w:pStyle w:val="FirstParagraph"/>
-      </w:pPr>
-      <w:r>
+        <w:rPr>
+          <w:lang w:val="es-VE"/>
+        </w:rPr>
+      </w:pPr>
+      <w:r>
+        <w:rPr>
+          <w:lang w:val="es-VE"/>
+        </w:rPr>
         <w:t>Contiene el archivo HTML prototipo con todas las secciones visuales del site:</w:t>
       </w:r>
     </w:p>
     <w:p>
       <w:pPr>
         <w:pStyle w:val="SourceCode"/>
-      </w:pPr>
-      <w:r>
-        <w:rPr>
-          <w:rStyle w:val="VerbatimChar"/>
-        </w:rPr>
-        <w:t>Prototype/index.html</w:t>
+        <w:rPr>
+          <w:lang w:val="es-VE"/>
+        </w:rPr>
+      </w:pPr>
+      <w:proofErr w:type="spellStart"/>
+      <w:r>
+        <w:rPr>
+          <w:rStyle w:val="VerbatimChar"/>
+          <w:lang w:val="es-VE"/>
+        </w:rPr>
+        <w:t>Prototype</w:t>
+      </w:r>
+      <w:proofErr w:type="spellEnd"/>
+      <w:r>
+        <w:rPr>
+          <w:rStyle w:val="VerbatimChar"/>
+          <w:lang w:val="es-VE"/>
+        </w:rPr>
+        <w:t>/index.html</w:t>
       </w:r>
     </w:p>
     <w:p>
       <w:pPr>
         <w:pStyle w:val="FirstParagraph"/>
-      </w:pPr>
-      <w:r>
-        <w:t>Este HTML es el diseño base que debe convertirse a templates Angular.</w:t>
+        <w:rPr>
+          <w:lang w:val="es-VE"/>
+        </w:rPr>
+      </w:pPr>
+      <w:r>
+        <w:rPr>
+          <w:lang w:val="es-VE"/>
+        </w:rPr>
+        <w:t xml:space="preserve">Este HTML es el diseño base que debe convertirse a </w:t>
+      </w:r>
+      <w:proofErr w:type="spellStart"/>
+      <w:r>
+        <w:rPr>
+          <w:lang w:val="es-VE"/>
+        </w:rPr>
+        <w:t>templates</w:t>
+      </w:r>
+      <w:proofErr w:type="spellEnd"/>
+      <w:r>
+        <w:rPr>
+          <w:lang w:val="es-VE"/>
+        </w:rPr>
+        <w:t xml:space="preserve"> Angular.</w:t>
       </w:r>
     </w:p>
     <w:p>
       <w:pPr>
         <w:pStyle w:val="Heading2"/>
+        <w:rPr>
+          <w:lang w:val="es-VE"/>
+        </w:rPr>
       </w:pPr>
       <w:bookmarkStart w:id="7" w:name="pendientes-principales"/>
       <w:bookmarkEnd w:id="2"/>
       <w:bookmarkEnd w:id="6"/>
       <w:r>
+        <w:rPr>
+          <w:lang w:val="es-VE"/>
+        </w:rPr>
         <w:t xml:space="preserve">3. </w:t>
       </w:r>
       <w:r>
+        <w:rPr>
+          <w:lang w:val="es-VE"/>
+        </w:rPr>
         <w:t xml:space="preserve">FE </w:t>
       </w:r>
-      <w:proofErr w:type="spellStart"/>
-      <w:r>
-        <w:t>Pendientes</w:t>
-      </w:r>
-      <w:proofErr w:type="spellEnd"/>
-      <w:r>
-        <w:t xml:space="preserve"> </w:t>
-      </w:r>
-      <w:proofErr w:type="spellStart"/>
-      <w:r>
-        <w:t>principales</w:t>
-      </w:r>
-      <w:proofErr w:type="spellEnd"/>
+      <w:r>
+        <w:rPr>
+          <w:lang w:val="es-VE"/>
+        </w:rPr>
+        <w:t>Pendientes principales</w:t>
+      </w:r>
     </w:p>
     <w:p>
       <w:pPr>
         <w:pStyle w:val="Heading3"/>
+        <w:rPr>
+          <w:lang w:val="es-VE"/>
+        </w:rPr>
       </w:pPr>
       <w:bookmarkStart w:id="8" w:name="Xcb271b08f88b3b3f29dcb9886353e20743eb11e"/>
       <w:r>
-        <w:t xml:space="preserve">FE - </w:t>
-      </w:r>
-      <w:proofErr w:type="spellStart"/>
-      <w:r>
-        <w:t>Pendiente</w:t>
-      </w:r>
-      <w:proofErr w:type="spellEnd"/>
-      <w:r>
-        <w:t xml:space="preserve"> 1 — </w:t>
-      </w:r>
-      <w:proofErr w:type="spellStart"/>
-      <w:r>
-        <w:t>Convertir</w:t>
-      </w:r>
-      <w:proofErr w:type="spellEnd"/>
-      <w:r>
-        <w:t xml:space="preserve"> </w:t>
-      </w:r>
-      <w:proofErr w:type="spellStart"/>
-      <w:r>
-        <w:t>secciones</w:t>
-      </w:r>
-      <w:proofErr w:type="spellEnd"/>
-      <w:r>
-        <w:t xml:space="preserve"> del HTML prototipo a componentes Angular</w:t>
+        <w:rPr>
+          <w:lang w:val="es-VE"/>
+        </w:rPr>
+        <w:t>FE - Pendiente 1 — Convertir secciones del HTML prototipo a componentes Angular</w:t>
       </w:r>
     </w:p>
     <w:p>
       <w:pPr>
         <w:pStyle w:val="FirstParagraph"/>
-      </w:pPr>
-      <w:r>
+        <w:rPr>
+          <w:lang w:val="es-VE"/>
+        </w:rPr>
+      </w:pPr>
+      <w:r>
+        <w:rPr>
+          <w:lang w:val="es-VE"/>
+        </w:rPr>
         <w:t>El trabajo más importante pendiente es tomar las secciones del archivo:</w:t>
       </w:r>
     </w:p>
     <w:p>
       <w:pPr>
         <w:pStyle w:val="SourceCode"/>
-      </w:pPr>
-      <w:r>
-        <w:rPr>
-          <w:rStyle w:val="VerbatimChar"/>
-        </w:rPr>
-        <w:t>Prototype/index.html</w:t>
+        <w:rPr>
+          <w:lang w:val="es-VE"/>
+        </w:rPr>
+      </w:pPr>
+      <w:proofErr w:type="spellStart"/>
+      <w:r>
+        <w:rPr>
+          <w:rStyle w:val="VerbatimChar"/>
+          <w:lang w:val="es-VE"/>
+        </w:rPr>
+        <w:t>Prototype</w:t>
+      </w:r>
+      <w:proofErr w:type="spellEnd"/>
+      <w:r>
+        <w:rPr>
+          <w:rStyle w:val="VerbatimChar"/>
+          <w:lang w:val="es-VE"/>
+        </w:rPr>
+        <w:t>/index.html</w:t>
       </w:r>
     </w:p>
     <w:p>
       <w:pPr>
         <w:pStyle w:val="FirstParagraph"/>
-      </w:pPr>
-      <w:r>
-        <w:t>y convertir cada sección en el template correspondiente de Angular.</w:t>
+        <w:rPr>
+          <w:lang w:val="es-VE"/>
+        </w:rPr>
+      </w:pPr>
+      <w:r>
+        <w:rPr>
+          <w:lang w:val="es-VE"/>
+        </w:rPr>
+        <w:t xml:space="preserve">y convertir cada sección en el </w:t>
+      </w:r>
+      <w:proofErr w:type="spellStart"/>
+      <w:r>
+        <w:rPr>
+          <w:lang w:val="es-VE"/>
+        </w:rPr>
+        <w:t>template</w:t>
+      </w:r>
+      <w:proofErr w:type="spellEnd"/>
+      <w:r>
+        <w:rPr>
+          <w:lang w:val="es-VE"/>
+        </w:rPr>
+        <w:t xml:space="preserve"> correspondiente de Angular.</w:t>
       </w:r>
     </w:p>
     <w:p>
       <w:pPr>
         <w:pStyle w:val="BodyText"/>
-      </w:pPr>
-      <w:r>
+        <w:rPr>
+          <w:lang w:val="es-VE"/>
+        </w:rPr>
+      </w:pPr>
+      <w:r>
+        <w:rPr>
+          <w:lang w:val="es-VE"/>
+        </w:rPr>
         <w:t>Ejemplos:</w:t>
       </w:r>
     </w:p>
     <w:p>
       <w:pPr>
         <w:pStyle w:val="SourceCode"/>
-      </w:pPr>
-      <w:r>
-        <w:rPr>
-          <w:rStyle w:val="VerbatimChar"/>
-        </w:rPr>
-        <w:t>#view-home  → home.component.html</w:t>
-      </w:r>
-      <w:r>
-        <w:br/>
-      </w:r>
-      <w:r>
-        <w:rPr>
-          <w:rStyle w:val="VerbatimChar"/>
-        </w:rPr>
-        <w:t>#view-lost  → lost.component.html</w:t>
-      </w:r>
-      <w:r>
-        <w:br/>
-      </w:r>
-      <w:r>
-        <w:rPr>
-          <w:rStyle w:val="VerbatimChar"/>
+        <w:rPr>
+          <w:lang w:val="es-VE"/>
+        </w:rPr>
+      </w:pPr>
+      <w:r>
+        <w:rPr>
+          <w:rStyle w:val="VerbatimChar"/>
+          <w:lang w:val="es-VE"/>
+        </w:rPr>
+        <w:t>#view-</w:t>
+      </w:r>
+      <w:proofErr w:type="gramStart"/>
+      <w:r>
+        <w:rPr>
+          <w:rStyle w:val="VerbatimChar"/>
+          <w:lang w:val="es-VE"/>
+        </w:rPr>
+        <w:t>home  →</w:t>
+      </w:r>
+      <w:proofErr w:type="gramEnd"/>
+      <w:r>
+        <w:rPr>
+          <w:rStyle w:val="VerbatimChar"/>
+          <w:lang w:val="es-VE"/>
+        </w:rPr>
+        <w:t xml:space="preserve"> home.component.html</w:t>
+      </w:r>
+      <w:r>
+        <w:rPr>
+          <w:lang w:val="es-VE"/>
+        </w:rPr>
+        <w:br/>
+      </w:r>
+      <w:r>
+        <w:rPr>
+          <w:rStyle w:val="VerbatimChar"/>
+          <w:lang w:val="es-VE"/>
+        </w:rPr>
+        <w:t>#view-</w:t>
+      </w:r>
+      <w:proofErr w:type="gramStart"/>
+      <w:r>
+        <w:rPr>
+          <w:rStyle w:val="VerbatimChar"/>
+          <w:lang w:val="es-VE"/>
+        </w:rPr>
+        <w:t>lost  →</w:t>
+      </w:r>
+      <w:proofErr w:type="gramEnd"/>
+      <w:r>
+        <w:rPr>
+          <w:rStyle w:val="VerbatimChar"/>
+          <w:lang w:val="es-VE"/>
+        </w:rPr>
+        <w:t xml:space="preserve"> lost.component.html</w:t>
+      </w:r>
+      <w:r>
+        <w:rPr>
+          <w:lang w:val="es-VE"/>
+        </w:rPr>
+        <w:br/>
+      </w:r>
+      <w:r>
+        <w:rPr>
+          <w:rStyle w:val="VerbatimChar"/>
+          <w:lang w:val="es-VE"/>
         </w:rPr>
         <w:t>#view-found → found.component.html</w:t>
       </w:r>
       <w:r>
-        <w:br/>
-      </w:r>
-      <w:r>
-        <w:rPr>
-          <w:rStyle w:val="VerbatimChar"/>
+        <w:rPr>
+          <w:lang w:val="es-VE"/>
+        </w:rPr>
+        <w:br/>
+      </w:r>
+      <w:r>
+        <w:rPr>
+          <w:rStyle w:val="VerbatimChar"/>
+          <w:lang w:val="es-VE"/>
         </w:rPr>
         <w:t>#view-shelters → shelters.component.html</w:t>
       </w:r>
       <w:r>
-        <w:br/>
-      </w:r>
-      <w:r>
-        <w:rPr>
-          <w:rStyle w:val="VerbatimChar"/>
+        <w:rPr>
+          <w:lang w:val="es-VE"/>
+        </w:rPr>
+        <w:br/>
+      </w:r>
+      <w:r>
+        <w:rPr>
+          <w:rStyle w:val="VerbatimChar"/>
+          <w:lang w:val="es-VE"/>
         </w:rPr>
         <w:lastRenderedPageBreak/>
         <w:t>#view-about → about.component.html</w:t>
       </w:r>
       <w:r>
-        <w:br/>
-      </w:r>
-      <w:r>
-        <w:rPr>
-          <w:rStyle w:val="VerbatimChar"/>
-        </w:rPr>
-        <w:t>#view-vet → vet-layout.component.html + sub-componentes</w:t>
-      </w:r>
+        <w:rPr>
+          <w:lang w:val="es-VE"/>
+        </w:rPr>
+        <w:br/>
+      </w:r>
+      <w:r>
+        <w:rPr>
+          <w:rStyle w:val="VerbatimChar"/>
+          <w:lang w:val="es-VE"/>
+        </w:rPr>
+        <w:t xml:space="preserve">#view-vet → vet-layout.component.html + </w:t>
+      </w:r>
+      <w:proofErr w:type="spellStart"/>
+      <w:r>
+        <w:rPr>
+          <w:rStyle w:val="VerbatimChar"/>
+          <w:lang w:val="es-VE"/>
+        </w:rPr>
+        <w:t>sub-componentes</w:t>
+      </w:r>
+      <w:proofErr w:type="spellEnd"/>
     </w:p>
     <w:p>
       <w:pPr>
         <w:pStyle w:val="FirstParagraph"/>
-      </w:pPr>
-      <w:r>
+        <w:rPr>
+          <w:lang w:val="es-VE"/>
+        </w:rPr>
+      </w:pPr>
+      <w:r>
+        <w:rPr>
+          <w:lang w:val="es-VE"/>
+        </w:rPr>
         <w:t>El objetivo es que el proyecto Angular deje de estar vacío y empiece a reflejar el diseño completo del prototipo HTML.</w:t>
       </w:r>
     </w:p>
     <w:p>
       <w:pPr>
         <w:pStyle w:val="BodyText"/>
-      </w:pPr>
-      <w:r>
+        <w:rPr>
+          <w:lang w:val="es-VE"/>
+        </w:rPr>
+      </w:pPr>
+      <w:r>
+        <w:rPr>
+          <w:lang w:val="es-VE"/>
+        </w:rPr>
         <w:t xml:space="preserve">Se debe revisar el </w:t>
       </w:r>
       <w:r>
         <w:rPr>
           <w:rStyle w:val="VerbatimChar"/>
+          <w:lang w:val="es-VE"/>
         </w:rPr>
         <w:t>index.html</w:t>
       </w:r>
       <w:r>
+        <w:rPr>
+          <w:lang w:val="es-VE"/>
+        </w:rPr>
         <w:t xml:space="preserve"> del prototipo y migrar:</w:t>
       </w:r>
     </w:p>
@@ -799,112 +1528,124 @@
     <w:p>
       <w:pPr>
         <w:pStyle w:val="FirstParagraph"/>
-      </w:pPr>
-      <w:r>
+        <w:rPr>
+          <w:lang w:val="es-VE"/>
+        </w:rPr>
+      </w:pPr>
+      <w:r>
+        <w:rPr>
+          <w:lang w:val="es-VE"/>
+        </w:rPr>
         <w:t>El SCSS ya fue copiado, por lo que idealmente se deben mantener las mismas clases CSS del prototipo para evitar rediseñar desde cero.</w:t>
       </w:r>
     </w:p>
     <w:p>
       <w:pPr>
         <w:pStyle w:val="Heading2"/>
+        <w:rPr>
+          <w:lang w:val="es-VE"/>
+        </w:rPr>
       </w:pPr>
       <w:bookmarkStart w:id="9" w:name="secciones-esperadas-en-angular"/>
       <w:bookmarkEnd w:id="7"/>
       <w:bookmarkEnd w:id="8"/>
       <w:r>
-        <w:t>3.1</w:t>
-      </w:r>
-      <w:r>
-        <w:t xml:space="preserve">. </w:t>
-      </w:r>
-      <w:r>
-        <w:t xml:space="preserve">FE - </w:t>
-      </w:r>
-      <w:proofErr w:type="spellStart"/>
-      <w:r>
-        <w:t>Secciones</w:t>
-      </w:r>
-      <w:proofErr w:type="spellEnd"/>
-      <w:r>
-        <w:t xml:space="preserve"> </w:t>
-      </w:r>
-      <w:proofErr w:type="spellStart"/>
-      <w:r>
-        <w:t>esperadas</w:t>
-      </w:r>
-      <w:proofErr w:type="spellEnd"/>
-      <w:r>
-        <w:t xml:space="preserve"> </w:t>
-      </w:r>
-      <w:proofErr w:type="spellStart"/>
-      <w:r>
-        <w:t>en</w:t>
-      </w:r>
-      <w:proofErr w:type="spellEnd"/>
-      <w:r>
-        <w:t xml:space="preserve"> Angular</w:t>
+        <w:rPr>
+          <w:lang w:val="es-VE"/>
+        </w:rPr>
+        <w:t>3.1. FE - Secciones esperadas en Angular</w:t>
       </w:r>
     </w:p>
     <w:p>
       <w:pPr>
         <w:pStyle w:val="FirstParagraph"/>
-      </w:pPr>
-      <w:r>
+        <w:rPr>
+          <w:lang w:val="es-VE"/>
+        </w:rPr>
+      </w:pPr>
+      <w:r>
+        <w:rPr>
+          <w:lang w:val="es-VE"/>
+        </w:rPr>
         <w:t>Se espera que el FE tenga, como mínimo, estas vistas/componentes:</w:t>
       </w:r>
     </w:p>
     <w:p>
       <w:pPr>
         <w:pStyle w:val="SourceCode"/>
-      </w:pPr>
-      <w:r>
-        <w:rPr>
-          <w:rStyle w:val="VerbatimChar"/>
+        <w:rPr>
+          <w:lang w:val="es-VE"/>
+        </w:rPr>
+      </w:pPr>
+      <w:r>
+        <w:rPr>
+          <w:rStyle w:val="VerbatimChar"/>
+          <w:lang w:val="es-VE"/>
         </w:rPr>
         <w:t>Home</w:t>
       </w:r>
       <w:r>
-        <w:br/>
-      </w:r>
-      <w:r>
-        <w:rPr>
-          <w:rStyle w:val="VerbatimChar"/>
+        <w:rPr>
+          <w:lang w:val="es-VE"/>
+        </w:rPr>
+        <w:br/>
+      </w:r>
+      <w:r>
+        <w:rPr>
+          <w:rStyle w:val="VerbatimChar"/>
+          <w:lang w:val="es-VE"/>
         </w:rPr>
         <w:t>Mascotas Perdidas</w:t>
       </w:r>
       <w:r>
-        <w:br/>
-      </w:r>
-      <w:r>
-        <w:rPr>
-          <w:rStyle w:val="VerbatimChar"/>
+        <w:rPr>
+          <w:lang w:val="es-VE"/>
+        </w:rPr>
+        <w:br/>
+      </w:r>
+      <w:r>
+        <w:rPr>
+          <w:rStyle w:val="VerbatimChar"/>
+          <w:lang w:val="es-VE"/>
         </w:rPr>
         <w:t>Mascotas Encontradas</w:t>
       </w:r>
       <w:r>
-        <w:br/>
-      </w:r>
-      <w:r>
-        <w:rPr>
-          <w:rStyle w:val="VerbatimChar"/>
+        <w:rPr>
+          <w:lang w:val="es-VE"/>
+        </w:rPr>
+        <w:br/>
+      </w:r>
+      <w:r>
+        <w:rPr>
+          <w:rStyle w:val="VerbatimChar"/>
+          <w:lang w:val="es-VE"/>
         </w:rPr>
         <w:t>Refugios Temporales</w:t>
       </w:r>
       <w:r>
-        <w:br/>
-      </w:r>
-      <w:r>
-        <w:rPr>
-          <w:rStyle w:val="VerbatimChar"/>
+        <w:rPr>
+          <w:lang w:val="es-VE"/>
+        </w:rPr>
+        <w:br/>
+      </w:r>
+      <w:r>
+        <w:rPr>
+          <w:rStyle w:val="VerbatimChar"/>
+          <w:lang w:val="es-VE"/>
         </w:rPr>
         <w:t>Acerca del Proyecto</w:t>
       </w:r>
       <w:r>
-        <w:br/>
-      </w:r>
-      <w:r>
-        <w:rPr>
-          <w:rStyle w:val="VerbatimChar"/>
+        <w:rPr>
+          <w:lang w:val="es-VE"/>
+        </w:rPr>
+        <w:br/>
+      </w:r>
+      <w:r>
+        <w:rPr>
+          <w:rStyle w:val="VerbatimChar"/>
+          <w:lang w:val="es-VE"/>
         </w:rPr>
         <w:t>Panel Veterinario / Admin</w:t>
       </w:r>
@@ -912,54 +1653,94 @@
     <w:p>
       <w:pPr>
         <w:pStyle w:val="FirstParagraph"/>
-      </w:pPr>
-      <w:r>
-        <w:t>Para el panel veterinario, la sección del prototipo puede dividirse en layout + subcomponentes, por ejemplo:</w:t>
+        <w:rPr>
+          <w:lang w:val="es-VE"/>
+        </w:rPr>
+      </w:pPr>
+      <w:r>
+        <w:rPr>
+          <w:lang w:val="es-VE"/>
+        </w:rPr>
+        <w:t xml:space="preserve">Para el panel veterinario, la sección del prototipo puede dividirse en </w:t>
+      </w:r>
+      <w:proofErr w:type="spellStart"/>
+      <w:r>
+        <w:rPr>
+          <w:lang w:val="es-VE"/>
+        </w:rPr>
+        <w:t>layout</w:t>
+      </w:r>
+      <w:proofErr w:type="spellEnd"/>
+      <w:r>
+        <w:rPr>
+          <w:lang w:val="es-VE"/>
+        </w:rPr>
+        <w:t xml:space="preserve"> + subcomponentes, por ejemplo:</w:t>
       </w:r>
     </w:p>
     <w:p>
       <w:pPr>
         <w:pStyle w:val="SourceCode"/>
-      </w:pPr>
-      <w:r>
-        <w:rPr>
-          <w:rStyle w:val="VerbatimChar"/>
+        <w:rPr>
+          <w:lang w:val="es-VE"/>
+        </w:rPr>
+      </w:pPr>
+      <w:r>
+        <w:rPr>
+          <w:rStyle w:val="VerbatimChar"/>
+          <w:lang w:val="es-VE"/>
         </w:rPr>
         <w:t>vet-layout.component.html</w:t>
       </w:r>
       <w:r>
-        <w:br/>
-      </w:r>
-      <w:r>
-        <w:rPr>
-          <w:rStyle w:val="VerbatimChar"/>
+        <w:rPr>
+          <w:lang w:val="es-VE"/>
+        </w:rPr>
+        <w:br/>
+      </w:r>
+      <w:r>
+        <w:rPr>
+          <w:rStyle w:val="VerbatimChar"/>
+          <w:lang w:val="es-VE"/>
         </w:rPr>
         <w:t>vet-dashboard.component.html</w:t>
       </w:r>
       <w:r>
-        <w:br/>
-      </w:r>
-      <w:r>
-        <w:rPr>
-          <w:rStyle w:val="VerbatimChar"/>
+        <w:rPr>
+          <w:lang w:val="es-VE"/>
+        </w:rPr>
+        <w:br/>
+      </w:r>
+      <w:r>
+        <w:rPr>
+          <w:rStyle w:val="VerbatimChar"/>
+          <w:lang w:val="es-VE"/>
         </w:rPr>
         <w:t>vet-solicitudes.component.html</w:t>
       </w:r>
       <w:r>
-        <w:br/>
-      </w:r>
-      <w:r>
-        <w:rPr>
-          <w:rStyle w:val="VerbatimChar"/>
+        <w:rPr>
+          <w:lang w:val="es-VE"/>
+        </w:rPr>
+        <w:br/>
+      </w:r>
+      <w:r>
+        <w:rPr>
+          <w:rStyle w:val="VerbatimChar"/>
+          <w:lang w:val="es-VE"/>
         </w:rPr>
         <w:t>vet-refugios.component.html</w:t>
       </w:r>
       <w:r>
-        <w:br/>
-      </w:r>
-      <w:r>
-        <w:rPr>
-          <w:rStyle w:val="VerbatimChar"/>
+        <w:rPr>
+          <w:lang w:val="es-VE"/>
+        </w:rPr>
+        <w:br/>
+      </w:r>
+      <w:r>
+        <w:rPr>
+          <w:rStyle w:val="VerbatimChar"/>
+          <w:lang w:val="es-VE"/>
         </w:rPr>
         <w:t>vet-animales.component.html</w:t>
       </w:r>
@@ -967,89 +1748,153 @@
     <w:p>
       <w:pPr>
         <w:pStyle w:val="FirstParagraph"/>
-      </w:pPr>
-      <w:r>
-        <w:t>Por ahora no es necesario implementar toda la lógica final del backend, pero sí dejar el layout y la estructura listos para conectar servicios.</w:t>
+        <w:rPr>
+          <w:lang w:val="es-VE"/>
+        </w:rPr>
+      </w:pPr>
+      <w:r>
+        <w:rPr>
+          <w:lang w:val="es-VE"/>
+        </w:rPr>
+        <w:t xml:space="preserve">Por ahora no es necesario implementar toda la lógica final del backend, pero sí dejar el </w:t>
+      </w:r>
+      <w:proofErr w:type="spellStart"/>
+      <w:r>
+        <w:rPr>
+          <w:lang w:val="es-VE"/>
+        </w:rPr>
+        <w:t>layout</w:t>
+      </w:r>
+      <w:proofErr w:type="spellEnd"/>
+      <w:r>
+        <w:rPr>
+          <w:lang w:val="es-VE"/>
+        </w:rPr>
+        <w:t xml:space="preserve"> y la estructura listos para conectar servicios.</w:t>
       </w:r>
     </w:p>
     <w:p>
       <w:pPr>
         <w:pStyle w:val="Heading2"/>
+        <w:rPr>
+          <w:lang w:val="es-VE"/>
+        </w:rPr>
       </w:pPr>
       <w:bookmarkStart w:id="10" w:name="Xf5cc5aae342ecc8f9ab0786c85981a47bb6e6d7"/>
       <w:bookmarkEnd w:id="9"/>
       <w:r>
-        <w:t>3.2</w:t>
-      </w:r>
-      <w:r>
-        <w:t xml:space="preserve">. </w:t>
-      </w:r>
-      <w:r>
-        <w:t xml:space="preserve">FE - </w:t>
-      </w:r>
-      <w:proofErr w:type="spellStart"/>
-      <w:r>
-        <w:t>Pendiente</w:t>
-      </w:r>
-      <w:proofErr w:type="spellEnd"/>
-      <w:r>
-        <w:t xml:space="preserve"> 2 — Registrar interceptor </w:t>
-      </w:r>
-      <w:proofErr w:type="spellStart"/>
-      <w:r>
-        <w:t>en</w:t>
-      </w:r>
-      <w:proofErr w:type="spellEnd"/>
-      <w:r>
+        <w:rPr>
+          <w:lang w:val="es-VE"/>
+        </w:rPr>
+        <w:t xml:space="preserve">3.2. FE - Pendiente 2 — Registrar interceptor en </w:t>
+      </w:r>
+      <w:proofErr w:type="spellStart"/>
+      <w:proofErr w:type="gramStart"/>
+      <w:r>
+        <w:rPr>
+          <w:rStyle w:val="VerbatimChar"/>
+          <w:lang w:val="es-VE"/>
+        </w:rPr>
+        <w:t>app</w:t>
+      </w:r>
+      <w:proofErr w:type="gramEnd"/>
+      <w:r>
+        <w:rPr>
+          <w:rStyle w:val="VerbatimChar"/>
+          <w:lang w:val="es-VE"/>
+        </w:rPr>
+        <w:t>.config.ts</w:t>
+      </w:r>
+      <w:proofErr w:type="spellEnd"/>
+    </w:p>
+    <w:p>
+      <w:pPr>
+        <w:pStyle w:val="FirstParagraph"/>
+        <w:rPr>
+          <w:lang w:val="es-VE"/>
+        </w:rPr>
+      </w:pPr>
+      <w:r>
+        <w:rPr>
+          <w:lang w:val="es-VE"/>
+        </w:rPr>
+        <w:t>Falta registrar el interceptor en Angular.</w:t>
+      </w:r>
+    </w:p>
+    <w:p>
+      <w:pPr>
+        <w:pStyle w:val="BodyText"/>
+        <w:rPr>
+          <w:lang w:val="es-VE"/>
+        </w:rPr>
+      </w:pPr>
+      <w:r>
+        <w:rPr>
+          <w:lang w:val="es-VE"/>
+        </w:rPr>
+        <w:t>Agregar o validar este bloque:</w:t>
+      </w:r>
+    </w:p>
+    <w:p>
+      <w:pPr>
+        <w:pStyle w:val="SourceCode"/>
+      </w:pPr>
+      <w:r>
+        <w:rPr>
+          <w:rStyle w:val="CommentTok"/>
+        </w:rPr>
+        <w:t xml:space="preserve">// </w:t>
+      </w:r>
+      <w:proofErr w:type="spellStart"/>
+      <w:r>
+        <w:rPr>
+          <w:rStyle w:val="CommentTok"/>
+        </w:rPr>
+        <w:t>src</w:t>
+      </w:r>
+      <w:proofErr w:type="spellEnd"/>
+      <w:r>
+        <w:rPr>
+          <w:rStyle w:val="CommentTok"/>
+        </w:rPr>
+        <w:t>/app/</w:t>
+      </w:r>
+      <w:proofErr w:type="spellStart"/>
+      <w:r>
+        <w:rPr>
+          <w:rStyle w:val="CommentTok"/>
+        </w:rPr>
+        <w:t>app.config.ts</w:t>
+      </w:r>
+      <w:proofErr w:type="spellEnd"/>
+      <w:r>
+        <w:br/>
+      </w:r>
+      <w:r>
+        <w:rPr>
+          <w:rStyle w:val="ImportTok"/>
+        </w:rPr>
+        <w:t>import</w:t>
+      </w:r>
+      <w:r>
+        <w:rPr>
+          <w:rStyle w:val="NormalTok"/>
+        </w:rPr>
         <w:t xml:space="preserve"> </w:t>
       </w:r>
-      <w:r>
-        <w:rPr>
-          <w:rStyle w:val="VerbatimChar"/>
-        </w:rPr>
-        <w:t>app.config.ts</w:t>
-      </w:r>
-    </w:p>
-    <w:p>
-      <w:pPr>
-        <w:pStyle w:val="FirstParagraph"/>
-      </w:pPr>
-      <w:r>
-        <w:t>Falta registrar el interceptor en Angular.</w:t>
-      </w:r>
-    </w:p>
-    <w:p>
-      <w:pPr>
-        <w:pStyle w:val="BodyText"/>
-      </w:pPr>
-      <w:r>
-        <w:t>Agregar o validar este bloque:</w:t>
-      </w:r>
-    </w:p>
-    <w:p>
-      <w:pPr>
-        <w:pStyle w:val="SourceCode"/>
-      </w:pPr>
-      <w:r>
-        <w:rPr>
-          <w:rStyle w:val="CommentTok"/>
-        </w:rPr>
-        <w:t>// src/app/app.config.ts</w:t>
-      </w:r>
-      <w:r>
-        <w:br/>
-      </w:r>
-      <w:r>
-        <w:rPr>
-          <w:rStyle w:val="ImportTok"/>
-        </w:rPr>
-        <w:t>import</w:t>
-      </w:r>
+      <w:proofErr w:type="gramStart"/>
       <w:r>
         <w:rPr>
           <w:rStyle w:val="NormalTok"/>
         </w:rPr>
-        <w:t xml:space="preserve"> { ApplicationConfig } </w:t>
+        <w:t>{ ApplicationConfig</w:t>
+      </w:r>
+      <w:proofErr w:type="gramEnd"/>
+      <w:r>
+        <w:rPr>
+          <w:rStyle w:val="NormalTok"/>
+        </w:rPr>
+        <w:t xml:space="preserve"> } </w:t>
       </w:r>
       <w:r>
         <w:rPr>
@@ -1089,7 +1934,21 @@
         <w:rPr>
           <w:rStyle w:val="NormalTok"/>
         </w:rPr>
-        <w:t xml:space="preserve"> { provideRouter } </w:t>
+        <w:t xml:space="preserve"> </w:t>
+      </w:r>
+      <w:proofErr w:type="gramStart"/>
+      <w:r>
+        <w:rPr>
+          <w:rStyle w:val="NormalTok"/>
+        </w:rPr>
+        <w:t>{ provideRouter</w:t>
+      </w:r>
+      <w:proofErr w:type="gramEnd"/>
+      <w:r>
+        <w:rPr>
+          <w:rStyle w:val="NormalTok"/>
+        </w:rPr>
+        <w:t xml:space="preserve"> } </w:t>
       </w:r>
       <w:r>
         <w:rPr>
@@ -1128,8 +1987,16 @@
         <w:rPr>
           <w:rStyle w:val="NormalTok"/>
         </w:rPr>
-        <w:t xml:space="preserve"> { provideHttpClient</w:t>
-      </w:r>
+        <w:t xml:space="preserve"> </w:t>
+      </w:r>
+      <w:proofErr w:type="gramStart"/>
+      <w:r>
+        <w:rPr>
+          <w:rStyle w:val="NormalTok"/>
+        </w:rPr>
+        <w:t>{ provideHttpClient</w:t>
+      </w:r>
+      <w:proofErr w:type="gramEnd"/>
       <w:r>
         <w:rPr>
           <w:rStyle w:val="OperatorTok"/>
@@ -1140,7 +2007,21 @@
         <w:rPr>
           <w:rStyle w:val="NormalTok"/>
         </w:rPr>
-        <w:t xml:space="preserve"> withInterceptors } </w:t>
+        <w:t xml:space="preserve"> </w:t>
+      </w:r>
+      <w:proofErr w:type="gramStart"/>
+      <w:r>
+        <w:rPr>
+          <w:rStyle w:val="NormalTok"/>
+        </w:rPr>
+        <w:t>withInterceptors }</w:t>
+      </w:r>
+      <w:proofErr w:type="gramEnd"/>
+      <w:r>
+        <w:rPr>
+          <w:rStyle w:val="NormalTok"/>
+        </w:rPr>
+        <w:t xml:space="preserve"> </w:t>
       </w:r>
       <w:r>
         <w:rPr>
@@ -1182,7 +2063,21 @@
         <w:rPr>
           <w:rStyle w:val="NormalTok"/>
         </w:rPr>
-        <w:t xml:space="preserve"> { routes } </w:t>
+        <w:t xml:space="preserve"> </w:t>
+      </w:r>
+      <w:proofErr w:type="gramStart"/>
+      <w:r>
+        <w:rPr>
+          <w:rStyle w:val="NormalTok"/>
+        </w:rPr>
+        <w:t>{ routes</w:t>
+      </w:r>
+      <w:proofErr w:type="gramEnd"/>
+      <w:r>
+        <w:rPr>
+          <w:rStyle w:val="NormalTok"/>
+        </w:rPr>
+        <w:t xml:space="preserve"> } </w:t>
       </w:r>
       <w:r>
         <w:rPr>
@@ -1221,7 +2116,21 @@
         <w:rPr>
           <w:rStyle w:val="NormalTok"/>
         </w:rPr>
-        <w:t xml:space="preserve"> { authInterceptor } </w:t>
+        <w:t xml:space="preserve"> </w:t>
+      </w:r>
+      <w:proofErr w:type="gramStart"/>
+      <w:r>
+        <w:rPr>
+          <w:rStyle w:val="NormalTok"/>
+        </w:rPr>
+        <w:t>{ authInterceptor</w:t>
+      </w:r>
+      <w:proofErr w:type="gramEnd"/>
+      <w:r>
+        <w:rPr>
+          <w:rStyle w:val="NormalTok"/>
+        </w:rPr>
+        <w:t xml:space="preserve"> } </w:t>
       </w:r>
       <w:r>
         <w:rPr>
@@ -1410,105 +2319,204 @@
     <w:p>
       <w:pPr>
         <w:pStyle w:val="FirstParagraph"/>
-      </w:pPr>
-      <w:r>
-        <w:t>Validar que el path del interceptor sea correcto:</w:t>
+        <w:rPr>
+          <w:lang w:val="es-VE"/>
+        </w:rPr>
+      </w:pPr>
+      <w:r>
+        <w:rPr>
+          <w:lang w:val="es-VE"/>
+        </w:rPr>
+        <w:t xml:space="preserve">Validar que el </w:t>
+      </w:r>
+      <w:proofErr w:type="spellStart"/>
+      <w:r>
+        <w:rPr>
+          <w:lang w:val="es-VE"/>
+        </w:rPr>
+        <w:t>path</w:t>
+      </w:r>
+      <w:proofErr w:type="spellEnd"/>
+      <w:r>
+        <w:rPr>
+          <w:lang w:val="es-VE"/>
+        </w:rPr>
+        <w:t xml:space="preserve"> del interceptor sea correcto:</w:t>
       </w:r>
     </w:p>
     <w:p>
       <w:pPr>
         <w:pStyle w:val="SourceCode"/>
       </w:pPr>
-      <w:r>
-        <w:rPr>
-          <w:rStyle w:val="VerbatimChar"/>
-        </w:rPr>
-        <w:t>src/app/core/auth/auth.interceptor.ts</w:t>
-      </w:r>
+      <w:proofErr w:type="spellStart"/>
+      <w:r>
+        <w:rPr>
+          <w:rStyle w:val="VerbatimChar"/>
+        </w:rPr>
+        <w:t>src</w:t>
+      </w:r>
+      <w:proofErr w:type="spellEnd"/>
+      <w:r>
+        <w:rPr>
+          <w:rStyle w:val="VerbatimChar"/>
+        </w:rPr>
+        <w:t>/app/core/auth/</w:t>
+      </w:r>
+      <w:proofErr w:type="spellStart"/>
+      <w:r>
+        <w:rPr>
+          <w:rStyle w:val="VerbatimChar"/>
+        </w:rPr>
+        <w:t>auth.interceptor.ts</w:t>
+      </w:r>
+      <w:proofErr w:type="spellEnd"/>
     </w:p>
     <w:p>
       <w:pPr>
         <w:pStyle w:val="FirstParagraph"/>
-      </w:pPr>
-      <w:r>
+        <w:rPr>
+          <w:lang w:val="es-VE"/>
+        </w:rPr>
+      </w:pPr>
+      <w:r>
+        <w:rPr>
+          <w:lang w:val="es-VE"/>
+        </w:rPr>
         <w:t>Si el archivo no existe, crearlo.</w:t>
       </w:r>
     </w:p>
     <w:p>
       <w:pPr>
         <w:pStyle w:val="Heading2"/>
+        <w:rPr>
+          <w:lang w:val="es-VE"/>
+        </w:rPr>
       </w:pPr>
       <w:bookmarkStart w:id="11" w:name="X313f21927b94dc94252b1209c27778f924e4336"/>
       <w:bookmarkEnd w:id="10"/>
       <w:r>
-        <w:t>3.3</w:t>
-      </w:r>
-      <w:r>
-        <w:t xml:space="preserve">. </w:t>
-      </w:r>
-      <w:r>
-        <w:t>FE -</w:t>
-      </w:r>
-      <w:proofErr w:type="spellStart"/>
-      <w:r>
-        <w:t>Pendiente</w:t>
-      </w:r>
-      <w:proofErr w:type="spellEnd"/>
-      <w:r>
-        <w:t xml:space="preserve"> 3 — Validar que el routing funcione</w:t>
+        <w:rPr>
+          <w:lang w:val="es-VE"/>
+        </w:rPr>
+        <w:t xml:space="preserve">3.3. FE -Pendiente 3 — Validar que el </w:t>
+      </w:r>
+      <w:proofErr w:type="spellStart"/>
+      <w:r>
+        <w:rPr>
+          <w:lang w:val="es-VE"/>
+        </w:rPr>
+        <w:t>routing</w:t>
+      </w:r>
+      <w:proofErr w:type="spellEnd"/>
+      <w:r>
+        <w:rPr>
+          <w:lang w:val="es-VE"/>
+        </w:rPr>
+        <w:t xml:space="preserve"> funcione</w:t>
       </w:r>
     </w:p>
     <w:p>
       <w:pPr>
         <w:pStyle w:val="FirstParagraph"/>
-      </w:pPr>
-      <w:r>
+        <w:rPr>
+          <w:lang w:val="es-VE"/>
+        </w:rPr>
+      </w:pPr>
+      <w:r>
+        <w:rPr>
+          <w:lang w:val="es-VE"/>
+        </w:rPr>
         <w:t xml:space="preserve">El archivo </w:t>
       </w:r>
-      <w:r>
-        <w:rPr>
-          <w:rStyle w:val="VerbatimChar"/>
-        </w:rPr>
-        <w:t>app.routes.ts</w:t>
-      </w:r>
-      <w:r>
-        <w:t xml:space="preserve"> ya fue llenado copiando el routing del MD, pero se debe validar que:</w:t>
+      <w:proofErr w:type="spellStart"/>
+      <w:proofErr w:type="gramStart"/>
+      <w:r>
+        <w:rPr>
+          <w:rStyle w:val="VerbatimChar"/>
+          <w:lang w:val="es-VE"/>
+        </w:rPr>
+        <w:t>app.routes</w:t>
+      </w:r>
+      <w:proofErr w:type="gramEnd"/>
+      <w:r>
+        <w:rPr>
+          <w:rStyle w:val="VerbatimChar"/>
+          <w:lang w:val="es-VE"/>
+        </w:rPr>
+        <w:t>.ts</w:t>
+      </w:r>
+      <w:proofErr w:type="spellEnd"/>
+      <w:r>
+        <w:rPr>
+          <w:lang w:val="es-VE"/>
+        </w:rPr>
+        <w:t xml:space="preserve"> ya fue llenado copiando el </w:t>
+      </w:r>
+      <w:proofErr w:type="spellStart"/>
+      <w:r>
+        <w:rPr>
+          <w:lang w:val="es-VE"/>
+        </w:rPr>
+        <w:t>routing</w:t>
+      </w:r>
+      <w:proofErr w:type="spellEnd"/>
+      <w:r>
+        <w:rPr>
+          <w:lang w:val="es-VE"/>
+        </w:rPr>
+        <w:t xml:space="preserve"> del MD, pero se debe validar que:</w:t>
       </w:r>
     </w:p>
     <w:p>
       <w:pPr>
         <w:pStyle w:val="SourceCode"/>
-      </w:pPr>
-      <w:r>
-        <w:rPr>
-          <w:rStyle w:val="VerbatimChar"/>
+        <w:rPr>
+          <w:lang w:val="es-VE"/>
+        </w:rPr>
+      </w:pPr>
+      <w:r>
+        <w:rPr>
+          <w:rStyle w:val="VerbatimChar"/>
+          <w:lang w:val="es-VE"/>
         </w:rPr>
         <w:t>Las rutas carguen correctamente</w:t>
       </w:r>
       <w:r>
-        <w:br/>
-      </w:r>
-      <w:r>
-        <w:rPr>
-          <w:rStyle w:val="VerbatimChar"/>
+        <w:rPr>
+          <w:lang w:val="es-VE"/>
+        </w:rPr>
+        <w:br/>
+      </w:r>
+      <w:r>
+        <w:rPr>
+          <w:rStyle w:val="VerbatimChar"/>
+          <w:lang w:val="es-VE"/>
         </w:rPr>
         <w:t>Los componentes estén importados correctamente</w:t>
       </w:r>
       <w:r>
-        <w:br/>
-      </w:r>
-      <w:r>
-        <w:rPr>
-          <w:rStyle w:val="VerbatimChar"/>
+        <w:rPr>
+          <w:lang w:val="es-VE"/>
+        </w:rPr>
+        <w:br/>
+      </w:r>
+      <w:r>
+        <w:rPr>
+          <w:rStyle w:val="VerbatimChar"/>
+          <w:lang w:val="es-VE"/>
         </w:rPr>
         <w:t>No existan rutas apuntando a componentes vacíos o inexistentes</w:t>
       </w:r>
       <w:r>
-        <w:br/>
-      </w:r>
-      <w:r>
-        <w:rPr>
-          <w:rStyle w:val="VerbatimChar"/>
+        <w:rPr>
+          <w:lang w:val="es-VE"/>
+        </w:rPr>
+        <w:br/>
+      </w:r>
+      <w:r>
+        <w:rPr>
+          <w:rStyle w:val="VerbatimChar"/>
+          <w:lang w:val="es-VE"/>
         </w:rPr>
         <w:t>El menú navegue entre vistas</w:t>
       </w:r>
@@ -1516,24 +2524,35 @@
     <w:p>
       <w:pPr>
         <w:pStyle w:val="FirstParagraph"/>
-      </w:pPr>
-      <w:r>
+        <w:rPr>
+          <w:lang w:val="es-VE"/>
+        </w:rPr>
+      </w:pPr>
+      <w:r>
+        <w:rPr>
+          <w:lang w:val="es-VE"/>
+        </w:rPr>
         <w:t>Correr:</w:t>
       </w:r>
     </w:p>
     <w:p>
       <w:pPr>
         <w:pStyle w:val="SourceCode"/>
+        <w:rPr>
+          <w:lang w:val="es-VE"/>
+        </w:rPr>
       </w:pPr>
       <w:r>
         <w:rPr>
           <w:rStyle w:val="ExtensionTok"/>
+          <w:lang w:val="es-VE"/>
         </w:rPr>
         <w:t>ng</w:t>
       </w:r>
       <w:r>
         <w:rPr>
           <w:rStyle w:val="NormalTok"/>
+          <w:lang w:val="es-VE"/>
         </w:rPr>
         <w:t xml:space="preserve"> serve</w:t>
       </w:r>
@@ -1541,18 +2560,28 @@
     <w:p>
       <w:pPr>
         <w:pStyle w:val="FirstParagraph"/>
-      </w:pPr>
-      <w:r>
+        <w:rPr>
+          <w:lang w:val="es-VE"/>
+        </w:rPr>
+      </w:pPr>
+      <w:r>
+        <w:rPr>
+          <w:lang w:val="es-VE"/>
+        </w:rPr>
         <w:t>Y validar en:</w:t>
       </w:r>
     </w:p>
     <w:p>
       <w:pPr>
         <w:pStyle w:val="SourceCode"/>
-      </w:pPr>
-      <w:r>
-        <w:rPr>
-          <w:rStyle w:val="VerbatimChar"/>
+        <w:rPr>
+          <w:lang w:val="es-VE"/>
+        </w:rPr>
+      </w:pPr>
+      <w:r>
+        <w:rPr>
+          <w:rStyle w:val="VerbatimChar"/>
+          <w:lang w:val="es-VE"/>
         </w:rPr>
         <w:t>http://localhost:4200</w:t>
       </w:r>
@@ -1560,193 +2589,240 @@
     <w:p>
       <w:pPr>
         <w:pStyle w:val="Heading2"/>
+        <w:rPr>
+          <w:lang w:val="es-VE"/>
+        </w:rPr>
       </w:pPr>
       <w:bookmarkStart w:id="12" w:name="X746a560b1bd6dd119f1430bbf7f497a517c4891"/>
       <w:bookmarkEnd w:id="11"/>
       <w:r>
-        <w:t>3.4</w:t>
-      </w:r>
-      <w:r>
-        <w:t xml:space="preserve">. </w:t>
-      </w:r>
-      <w:r>
-        <w:t xml:space="preserve"> </w:t>
-      </w:r>
-      <w:proofErr w:type="spellStart"/>
-      <w:r>
-        <w:t xml:space="preserve">FE - </w:t>
-      </w:r>
-      <w:r>
-        <w:t>Pendiente</w:t>
-      </w:r>
-      <w:proofErr w:type="spellEnd"/>
-      <w:r>
-        <w:t xml:space="preserve"> 4 — </w:t>
-      </w:r>
-      <w:proofErr w:type="spellStart"/>
-      <w:r>
-        <w:t>Revisar</w:t>
-      </w:r>
-      <w:proofErr w:type="spellEnd"/>
-      <w:r>
-        <w:t xml:space="preserve"> </w:t>
-      </w:r>
-      <w:proofErr w:type="spellStart"/>
-      <w:r>
-        <w:t>integración</w:t>
-      </w:r>
-      <w:proofErr w:type="spellEnd"/>
-      <w:r>
-        <w:t xml:space="preserve"> visual con el prototipo</w:t>
+        <w:rPr>
+          <w:lang w:val="es-VE"/>
+        </w:rPr>
+        <w:t>3.4.  FE - Pendiente 4 — Revisar integración visual con el prototipo</w:t>
       </w:r>
     </w:p>
     <w:p>
       <w:pPr>
         <w:pStyle w:val="FirstParagraph"/>
-      </w:pPr>
-      <w:r>
+        <w:rPr>
+          <w:lang w:val="es-VE"/>
+        </w:rPr>
+      </w:pPr>
+      <w:r>
+        <w:rPr>
+          <w:lang w:val="es-VE"/>
+        </w:rPr>
         <w:t>Una vez migrado el HTML a Angular, validar que:</w:t>
       </w:r>
     </w:p>
     <w:p>
       <w:pPr>
         <w:pStyle w:val="SourceCode"/>
-      </w:pPr>
-      <w:r>
-        <w:rPr>
-          <w:rStyle w:val="VerbatimChar"/>
+        <w:rPr>
+          <w:lang w:val="es-VE"/>
+        </w:rPr>
+      </w:pPr>
+      <w:r>
+        <w:rPr>
+          <w:rStyle w:val="VerbatimChar"/>
+          <w:lang w:val="es-VE"/>
         </w:rPr>
         <w:t>El home se vea igual o muy similar al prototipo</w:t>
       </w:r>
       <w:r>
-        <w:br/>
-      </w:r>
-      <w:r>
-        <w:rPr>
-          <w:rStyle w:val="VerbatimChar"/>
+        <w:rPr>
+          <w:lang w:val="es-VE"/>
+        </w:rPr>
+        <w:br/>
+      </w:r>
+      <w:r>
+        <w:rPr>
+          <w:rStyle w:val="VerbatimChar"/>
+          <w:lang w:val="es-VE"/>
         </w:rPr>
         <w:t>Las tarjetas de mascotas se muestren correctamente</w:t>
       </w:r>
       <w:r>
-        <w:br/>
-      </w:r>
-      <w:r>
-        <w:rPr>
-          <w:rStyle w:val="VerbatimChar"/>
+        <w:rPr>
+          <w:lang w:val="es-VE"/>
+        </w:rPr>
+        <w:br/>
+      </w:r>
+      <w:r>
+        <w:rPr>
+          <w:rStyle w:val="VerbatimChar"/>
+          <w:lang w:val="es-VE"/>
         </w:rPr>
         <w:t>Los formularios de reporte se vean correctamente</w:t>
       </w:r>
       <w:r>
-        <w:br/>
-      </w:r>
-      <w:r>
-        <w:rPr>
-          <w:rStyle w:val="VerbatimChar"/>
+        <w:rPr>
+          <w:lang w:val="es-VE"/>
+        </w:rPr>
+        <w:br/>
+      </w:r>
+      <w:r>
+        <w:rPr>
+          <w:rStyle w:val="VerbatimChar"/>
+          <w:lang w:val="es-VE"/>
         </w:rPr>
         <w:t>La sección de refugios se vea correctamente</w:t>
       </w:r>
       <w:r>
-        <w:br/>
-      </w:r>
-      <w:r>
-        <w:rPr>
-          <w:rStyle w:val="VerbatimChar"/>
-        </w:rPr>
-        <w:t>El panel veterinario tenga el layout del prototipo</w:t>
-      </w:r>
-      <w:r>
-        <w:br/>
-      </w:r>
-      <w:r>
-        <w:rPr>
-          <w:rStyle w:val="VerbatimChar"/>
-        </w:rPr>
-        <w:t>El diseño mobile siga funcionando</w:t>
+        <w:rPr>
+          <w:lang w:val="es-VE"/>
+        </w:rPr>
+        <w:br/>
+      </w:r>
+      <w:r>
+        <w:rPr>
+          <w:rStyle w:val="VerbatimChar"/>
+          <w:lang w:val="es-VE"/>
+        </w:rPr>
+        <w:t xml:space="preserve">El panel veterinario tenga el </w:t>
+      </w:r>
+      <w:proofErr w:type="spellStart"/>
+      <w:r>
+        <w:rPr>
+          <w:rStyle w:val="VerbatimChar"/>
+          <w:lang w:val="es-VE"/>
+        </w:rPr>
+        <w:t>layout</w:t>
+      </w:r>
+      <w:proofErr w:type="spellEnd"/>
+      <w:r>
+        <w:rPr>
+          <w:rStyle w:val="VerbatimChar"/>
+          <w:lang w:val="es-VE"/>
+        </w:rPr>
+        <w:t xml:space="preserve"> del prototipo</w:t>
+      </w:r>
+      <w:r>
+        <w:rPr>
+          <w:lang w:val="es-VE"/>
+        </w:rPr>
+        <w:br/>
+      </w:r>
+      <w:r>
+        <w:rPr>
+          <w:rStyle w:val="VerbatimChar"/>
+          <w:lang w:val="es-VE"/>
+        </w:rPr>
+        <w:t xml:space="preserve">El diseño </w:t>
+      </w:r>
+      <w:proofErr w:type="spellStart"/>
+      <w:r>
+        <w:rPr>
+          <w:rStyle w:val="VerbatimChar"/>
+          <w:lang w:val="es-VE"/>
+        </w:rPr>
+        <w:t>mobile</w:t>
+      </w:r>
+      <w:proofErr w:type="spellEnd"/>
+      <w:r>
+        <w:rPr>
+          <w:rStyle w:val="VerbatimChar"/>
+          <w:lang w:val="es-VE"/>
+        </w:rPr>
+        <w:t xml:space="preserve"> siga funcionando</w:t>
       </w:r>
     </w:p>
     <w:p>
       <w:pPr>
         <w:pStyle w:val="FirstParagraph"/>
-      </w:pPr>
-      <w:r>
+        <w:rPr>
+          <w:lang w:val="es-VE"/>
+        </w:rPr>
+      </w:pPr>
+      <w:r>
+        <w:rPr>
+          <w:lang w:val="es-VE"/>
+        </w:rPr>
         <w:t>Importante: no cambiar la intención visual del prototipo sin confirmar primero.</w:t>
       </w:r>
     </w:p>
     <w:p>
       <w:pPr>
         <w:pStyle w:val="Heading2"/>
+        <w:rPr>
+          <w:lang w:val="es-VE"/>
+        </w:rPr>
       </w:pPr>
       <w:bookmarkStart w:id="13" w:name="contexto-funcional-del-sistema"/>
       <w:bookmarkEnd w:id="12"/>
       <w:r>
+        <w:rPr>
+          <w:lang w:val="es-VE"/>
+        </w:rPr>
         <w:lastRenderedPageBreak/>
-        <w:t>3.5</w:t>
-      </w:r>
-      <w:r>
-        <w:t xml:space="preserve">. </w:t>
-      </w:r>
-      <w:r>
-        <w:t xml:space="preserve">FE - </w:t>
-      </w:r>
-      <w:proofErr w:type="spellStart"/>
-      <w:r>
-        <w:t>Contexto</w:t>
-      </w:r>
-      <w:proofErr w:type="spellEnd"/>
-      <w:r>
-        <w:t xml:space="preserve"> </w:t>
-      </w:r>
-      <w:proofErr w:type="spellStart"/>
-      <w:r>
-        <w:t>funcional</w:t>
-      </w:r>
-      <w:proofErr w:type="spellEnd"/>
-      <w:r>
-        <w:t xml:space="preserve"> del sistema</w:t>
+        <w:t>3.5. FE - Contexto funcional del sistema</w:t>
       </w:r>
     </w:p>
     <w:p>
       <w:pPr>
         <w:pStyle w:val="FirstParagraph"/>
-      </w:pPr>
-      <w:r>
+        <w:rPr>
+          <w:lang w:val="es-VE"/>
+        </w:rPr>
+      </w:pPr>
+      <w:r>
+        <w:rPr>
+          <w:lang w:val="es-VE"/>
+        </w:rPr>
         <w:t>El sistema es un sitio para ayuda en catástrofes/emergencias, enfocado en:</w:t>
       </w:r>
     </w:p>
     <w:p>
       <w:pPr>
         <w:pStyle w:val="SourceCode"/>
-      </w:pPr>
-      <w:r>
-        <w:rPr>
-          <w:rStyle w:val="VerbatimChar"/>
+        <w:rPr>
+          <w:lang w:val="es-VE"/>
+        </w:rPr>
+      </w:pPr>
+      <w:r>
+        <w:rPr>
+          <w:rStyle w:val="VerbatimChar"/>
+          <w:lang w:val="es-VE"/>
         </w:rPr>
         <w:t>Mascotas perdidas</w:t>
       </w:r>
       <w:r>
-        <w:br/>
-      </w:r>
-      <w:r>
-        <w:rPr>
-          <w:rStyle w:val="VerbatimChar"/>
+        <w:rPr>
+          <w:lang w:val="es-VE"/>
+        </w:rPr>
+        <w:br/>
+      </w:r>
+      <w:r>
+        <w:rPr>
+          <w:rStyle w:val="VerbatimChar"/>
+          <w:lang w:val="es-VE"/>
         </w:rPr>
         <w:t>Mascotas encontradas</w:t>
       </w:r>
       <w:r>
-        <w:br/>
-      </w:r>
-      <w:r>
-        <w:rPr>
-          <w:rStyle w:val="VerbatimChar"/>
+        <w:rPr>
+          <w:lang w:val="es-VE"/>
+        </w:rPr>
+        <w:br/>
+      </w:r>
+      <w:r>
+        <w:rPr>
+          <w:rStyle w:val="VerbatimChar"/>
+          <w:lang w:val="es-VE"/>
         </w:rPr>
         <w:t>Refugios temporales</w:t>
       </w:r>
       <w:r>
-        <w:br/>
-      </w:r>
-      <w:r>
-        <w:rPr>
-          <w:rStyle w:val="VerbatimChar"/>
+        <w:rPr>
+          <w:lang w:val="es-VE"/>
+        </w:rPr>
+        <w:br/>
+      </w:r>
+      <w:r>
+        <w:rPr>
+          <w:rStyle w:val="VerbatimChar"/>
+          <w:lang w:val="es-VE"/>
         </w:rPr>
         <w:t>Revisión veterinaria</w:t>
       </w:r>
@@ -1754,36 +2830,54 @@
     <w:p>
       <w:pPr>
         <w:pStyle w:val="FirstParagraph"/>
-      </w:pPr>
-      <w:r>
+        <w:rPr>
+          <w:lang w:val="es-VE"/>
+        </w:rPr>
+      </w:pPr>
+      <w:r>
+        <w:rPr>
+          <w:lang w:val="es-VE"/>
+        </w:rPr>
         <w:t>Los formularios públicos son:</w:t>
       </w:r>
     </w:p>
     <w:p>
       <w:pPr>
         <w:pStyle w:val="SourceCode"/>
-      </w:pPr>
-      <w:r>
-        <w:rPr>
-          <w:rStyle w:val="VerbatimChar"/>
+        <w:rPr>
+          <w:lang w:val="es-VE"/>
+        </w:rPr>
+      </w:pPr>
+      <w:r>
+        <w:rPr>
+          <w:rStyle w:val="VerbatimChar"/>
+          <w:lang w:val="es-VE"/>
         </w:rPr>
         <w:t>1. Reportar mascota perdida</w:t>
       </w:r>
       <w:r>
-        <w:br/>
-      </w:r>
-      <w:r>
-        <w:rPr>
-          <w:rStyle w:val="VerbatimChar"/>
+        <w:rPr>
+          <w:lang w:val="es-VE"/>
+        </w:rPr>
+        <w:br/>
+      </w:r>
+      <w:r>
+        <w:rPr>
+          <w:rStyle w:val="VerbatimChar"/>
+          <w:lang w:val="es-VE"/>
         </w:rPr>
         <w:t>2. Reportar mascota encontrada</w:t>
       </w:r>
       <w:r>
-        <w:br/>
-      </w:r>
-      <w:r>
-        <w:rPr>
-          <w:rStyle w:val="VerbatimChar"/>
+        <w:rPr>
+          <w:lang w:val="es-VE"/>
+        </w:rPr>
+        <w:br/>
+      </w:r>
+      <w:r>
+        <w:rPr>
+          <w:rStyle w:val="VerbatimChar"/>
+          <w:lang w:val="es-VE"/>
         </w:rPr>
         <w:t>3. Registrar refugio temporal</w:t>
       </w:r>
@@ -1791,183 +2885,300 @@
     <w:p>
       <w:pPr>
         <w:pStyle w:val="FirstParagraph"/>
-      </w:pPr>
-      <w:r>
+        <w:rPr>
+          <w:lang w:val="es-VE"/>
+        </w:rPr>
+      </w:pPr>
+      <w:r>
+        <w:rPr>
+          <w:lang w:val="es-VE"/>
+        </w:rPr>
         <w:t>Los usuarios públicos no se registran en la página.</w:t>
       </w:r>
     </w:p>
     <w:p>
       <w:pPr>
         <w:pStyle w:val="BodyText"/>
-      </w:pPr>
-      <w:r>
+        <w:rPr>
+          <w:lang w:val="es-VE"/>
+        </w:rPr>
+      </w:pPr>
+      <w:r>
+        <w:rPr>
+          <w:lang w:val="es-VE"/>
+        </w:rPr>
         <w:t xml:space="preserve">El módulo de </w:t>
       </w:r>
-      <w:r>
-        <w:rPr>
-          <w:rStyle w:val="VerbatimChar"/>
+      <w:proofErr w:type="spellStart"/>
+      <w:r>
+        <w:rPr>
+          <w:rStyle w:val="VerbatimChar"/>
+          <w:lang w:val="es-VE"/>
         </w:rPr>
         <w:t>User</w:t>
       </w:r>
-      <w:r>
+      <w:proofErr w:type="spellEnd"/>
+      <w:r>
+        <w:rPr>
+          <w:lang w:val="es-VE"/>
+        </w:rPr>
         <w:t xml:space="preserve"> y </w:t>
       </w:r>
       <w:r>
         <w:rPr>
           <w:rStyle w:val="VerbatimChar"/>
+          <w:lang w:val="es-VE"/>
         </w:rPr>
         <w:t>Role</w:t>
       </w:r>
       <w:r>
+        <w:rPr>
+          <w:lang w:val="es-VE"/>
+        </w:rPr>
         <w:t xml:space="preserve"> existe solo para uso interno/futuro. Por ahora, el portal de configuración/revisión será usado por veterinarios/admin.</w:t>
       </w:r>
     </w:p>
     <w:p>
       <w:pPr>
         <w:pStyle w:val="Heading2"/>
+        <w:rPr>
+          <w:lang w:val="es-VE"/>
+        </w:rPr>
       </w:pPr>
       <w:bookmarkStart w:id="14" w:name="modelo-er-base-de-datos"/>
       <w:bookmarkEnd w:id="13"/>
       <w:r>
-        <w:t>4</w:t>
-      </w:r>
-      <w:r>
-        <w:t>. Modelo ER / Base de datos</w:t>
+        <w:rPr>
+          <w:lang w:val="es-VE"/>
+        </w:rPr>
+        <w:t>4. Modelo ER / Base de datos</w:t>
       </w:r>
     </w:p>
     <w:p>
       <w:pPr>
         <w:pStyle w:val="FirstParagraph"/>
-      </w:pPr>
-      <w:r>
+        <w:rPr>
+          <w:lang w:val="es-VE"/>
+        </w:rPr>
+      </w:pPr>
+      <w:r>
+        <w:rPr>
+          <w:lang w:val="es-VE"/>
+        </w:rPr>
         <w:t>El modelo ER ya está definido en:</w:t>
       </w:r>
     </w:p>
     <w:p>
       <w:pPr>
         <w:pStyle w:val="SourceCode"/>
-      </w:pPr>
-      <w:r>
-        <w:rPr>
-          <w:rStyle w:val="VerbatimChar"/>
-        </w:rPr>
-        <w:t>AnalysisDesign/</w:t>
+        <w:rPr>
+          <w:lang w:val="es-VE"/>
+        </w:rPr>
+      </w:pPr>
+      <w:proofErr w:type="spellStart"/>
+      <w:r>
+        <w:rPr>
+          <w:rStyle w:val="VerbatimChar"/>
+          <w:lang w:val="es-VE"/>
+        </w:rPr>
+        <w:t>AnalysisDesign</w:t>
+      </w:r>
+      <w:proofErr w:type="spellEnd"/>
+      <w:r>
+        <w:rPr>
+          <w:rStyle w:val="VerbatimChar"/>
+          <w:lang w:val="es-VE"/>
+        </w:rPr>
+        <w:t>/</w:t>
       </w:r>
     </w:p>
     <w:p>
       <w:pPr>
         <w:pStyle w:val="FirstParagraph"/>
-      </w:pPr>
-      <w:r>
+        <w:rPr>
+          <w:lang w:val="es-VE"/>
+        </w:rPr>
+      </w:pPr>
+      <w:r>
+        <w:rPr>
+          <w:lang w:val="es-VE"/>
+        </w:rPr>
         <w:t>El script de base de datos ya está listo en:</w:t>
       </w:r>
     </w:p>
     <w:p>
       <w:pPr>
         <w:pStyle w:val="SourceCode"/>
-      </w:pPr>
-      <w:r>
-        <w:rPr>
-          <w:rStyle w:val="VerbatimChar"/>
-        </w:rPr>
-        <w:t>DB/veterinarios_venezuela_db.sql</w:t>
-      </w:r>
+        <w:rPr>
+          <w:lang w:val="es-VE"/>
+        </w:rPr>
+      </w:pPr>
+      <w:r>
+        <w:rPr>
+          <w:rStyle w:val="VerbatimChar"/>
+          <w:lang w:val="es-VE"/>
+        </w:rPr>
+        <w:t>DB/</w:t>
+      </w:r>
+      <w:proofErr w:type="spellStart"/>
+      <w:r>
+        <w:rPr>
+          <w:rStyle w:val="VerbatimChar"/>
+          <w:lang w:val="es-VE"/>
+        </w:rPr>
+        <w:t>veterinarios_venezuela_db.sql</w:t>
+      </w:r>
+      <w:proofErr w:type="spellEnd"/>
     </w:p>
     <w:p>
       <w:pPr>
         <w:pStyle w:val="FirstParagraph"/>
-      </w:pPr>
-      <w:r>
+        <w:rPr>
+          <w:lang w:val="es-VE"/>
+        </w:rPr>
+      </w:pPr>
+      <w:r>
+        <w:rPr>
+          <w:lang w:val="es-VE"/>
+        </w:rPr>
         <w:t>Por ahora no se requiere modificar el modelo sin revisar primero.</w:t>
       </w:r>
     </w:p>
     <w:p>
       <w:pPr>
         <w:pStyle w:val="BodyText"/>
-      </w:pPr>
-      <w:r>
+        <w:rPr>
+          <w:lang w:val="es-VE"/>
+        </w:rPr>
+      </w:pPr>
+      <w:r>
+        <w:rPr>
+          <w:lang w:val="es-VE"/>
+        </w:rPr>
         <w:t>Entidades principales:</w:t>
       </w:r>
     </w:p>
     <w:p>
       <w:pPr>
         <w:pStyle w:val="SourceCode"/>
-      </w:pPr>
-      <w:r>
-        <w:rPr>
-          <w:rStyle w:val="VerbatimChar"/>
+        <w:rPr>
+          <w:lang w:val="es-VE"/>
+        </w:rPr>
+      </w:pPr>
+      <w:r>
+        <w:rPr>
+          <w:rStyle w:val="VerbatimChar"/>
+          <w:lang w:val="es-VE"/>
         </w:rPr>
         <w:t>Animal</w:t>
       </w:r>
       <w:r>
-        <w:br/>
-      </w:r>
-      <w:r>
-        <w:rPr>
-          <w:rStyle w:val="VerbatimChar"/>
+        <w:rPr>
+          <w:lang w:val="es-VE"/>
+        </w:rPr>
+        <w:br/>
+      </w:r>
+      <w:r>
+        <w:rPr>
+          <w:rStyle w:val="VerbatimChar"/>
+          <w:lang w:val="es-VE"/>
         </w:rPr>
         <w:t>Solicitud</w:t>
       </w:r>
       <w:r>
-        <w:br/>
-      </w:r>
-      <w:r>
-        <w:rPr>
-          <w:rStyle w:val="VerbatimChar"/>
+        <w:rPr>
+          <w:lang w:val="es-VE"/>
+        </w:rPr>
+        <w:br/>
+      </w:r>
+      <w:r>
+        <w:rPr>
+          <w:rStyle w:val="VerbatimChar"/>
+          <w:lang w:val="es-VE"/>
         </w:rPr>
         <w:t>Refugio</w:t>
       </w:r>
       <w:r>
-        <w:br/>
-      </w:r>
-      <w:r>
-        <w:rPr>
-          <w:rStyle w:val="VerbatimChar"/>
+        <w:rPr>
+          <w:lang w:val="es-VE"/>
+        </w:rPr>
+        <w:br/>
+      </w:r>
+      <w:proofErr w:type="spellStart"/>
+      <w:r>
+        <w:rPr>
+          <w:rStyle w:val="VerbatimChar"/>
+          <w:lang w:val="es-VE"/>
         </w:rPr>
         <w:t>RevisionVeterinaria</w:t>
       </w:r>
-      <w:r>
-        <w:br/>
-      </w:r>
-      <w:r>
-        <w:rPr>
-          <w:rStyle w:val="VerbatimChar"/>
+      <w:proofErr w:type="spellEnd"/>
+      <w:r>
+        <w:rPr>
+          <w:lang w:val="es-VE"/>
+        </w:rPr>
+        <w:br/>
+      </w:r>
+      <w:r>
+        <w:rPr>
+          <w:rStyle w:val="VerbatimChar"/>
+          <w:lang w:val="es-VE"/>
         </w:rPr>
         <w:t>Contacto</w:t>
       </w:r>
       <w:r>
-        <w:br/>
-      </w:r>
-      <w:r>
-        <w:rPr>
-          <w:rStyle w:val="VerbatimChar"/>
+        <w:rPr>
+          <w:lang w:val="es-VE"/>
+        </w:rPr>
+        <w:br/>
+      </w:r>
+      <w:proofErr w:type="spellStart"/>
+      <w:r>
+        <w:rPr>
+          <w:rStyle w:val="VerbatimChar"/>
+          <w:lang w:val="es-VE"/>
         </w:rPr>
         <w:t>Ubicacion</w:t>
       </w:r>
-      <w:r>
-        <w:br/>
-      </w:r>
-      <w:r>
-        <w:rPr>
-          <w:rStyle w:val="VerbatimChar"/>
+      <w:proofErr w:type="spellEnd"/>
+      <w:r>
+        <w:rPr>
+          <w:lang w:val="es-VE"/>
+        </w:rPr>
+        <w:br/>
+      </w:r>
+      <w:r>
+        <w:rPr>
+          <w:rStyle w:val="VerbatimChar"/>
+          <w:lang w:val="es-VE"/>
         </w:rPr>
         <w:t>Estado</w:t>
       </w:r>
       <w:r>
-        <w:br/>
-      </w:r>
-      <w:r>
-        <w:rPr>
-          <w:rStyle w:val="VerbatimChar"/>
+        <w:rPr>
+          <w:lang w:val="es-VE"/>
+        </w:rPr>
+        <w:br/>
+      </w:r>
+      <w:proofErr w:type="spellStart"/>
+      <w:r>
+        <w:rPr>
+          <w:rStyle w:val="VerbatimChar"/>
+          <w:lang w:val="es-VE"/>
         </w:rPr>
         <w:t>User</w:t>
       </w:r>
-      <w:r>
-        <w:br/>
-      </w:r>
-      <w:r>
-        <w:rPr>
-          <w:rStyle w:val="VerbatimChar"/>
+      <w:proofErr w:type="spellEnd"/>
+      <w:r>
+        <w:rPr>
+          <w:lang w:val="es-VE"/>
+        </w:rPr>
+        <w:br/>
+      </w:r>
+      <w:r>
+        <w:rPr>
+          <w:rStyle w:val="VerbatimChar"/>
+          <w:lang w:val="es-VE"/>
         </w:rPr>
         <w:t>Role</w:t>
       </w:r>
@@ -1975,47 +3186,160 @@
     <w:p>
       <w:pPr>
         <w:pStyle w:val="FirstParagraph"/>
-      </w:pPr>
-      <w:r>
+        <w:rPr>
+          <w:lang w:val="es-VE"/>
+        </w:rPr>
+      </w:pPr>
+      <w:r>
+        <w:rPr>
+          <w:lang w:val="es-VE"/>
+        </w:rPr>
         <w:t>Notas importantes:</w:t>
       </w:r>
     </w:p>
     <w:p>
       <w:pPr>
         <w:pStyle w:val="SourceCode"/>
-      </w:pPr>
-      <w:r>
-        <w:rPr>
-          <w:rStyle w:val="VerbatimChar"/>
-        </w:rPr>
-        <w:t>Solicitud y Refugio no están linkeados a User porque los reportes son públicos/anónimos.</w:t>
-      </w:r>
-      <w:r>
-        <w:br/>
-      </w:r>
-      <w:r>
-        <w:rPr>
-          <w:rStyle w:val="VerbatimChar"/>
-        </w:rPr>
-        <w:t>Las fotos del animal irán en S3 usando el PK de Solicitud como parte del path.</w:t>
-      </w:r>
-      <w:r>
-        <w:br/>
-      </w:r>
-      <w:r>
-        <w:rPr>
-          <w:rStyle w:val="VerbatimChar"/>
-        </w:rPr>
-        <w:t>RevisionVeterinaria está relacionada con Animal y con User, donde User representa al veterinario que revisa.</w:t>
+        <w:rPr>
+          <w:lang w:val="es-VE"/>
+        </w:rPr>
+      </w:pPr>
+      <w:r>
+        <w:rPr>
+          <w:rStyle w:val="VerbatimChar"/>
+          <w:lang w:val="es-VE"/>
+        </w:rPr>
+        <w:t xml:space="preserve">Solicitud y Refugio no están </w:t>
+      </w:r>
+      <w:proofErr w:type="spellStart"/>
+      <w:r>
+        <w:rPr>
+          <w:rStyle w:val="VerbatimChar"/>
+          <w:lang w:val="es-VE"/>
+        </w:rPr>
+        <w:t>linkeados</w:t>
+      </w:r>
+      <w:proofErr w:type="spellEnd"/>
+      <w:r>
+        <w:rPr>
+          <w:rStyle w:val="VerbatimChar"/>
+          <w:lang w:val="es-VE"/>
+        </w:rPr>
+        <w:t xml:space="preserve"> a </w:t>
+      </w:r>
+      <w:proofErr w:type="spellStart"/>
+      <w:r>
+        <w:rPr>
+          <w:rStyle w:val="VerbatimChar"/>
+          <w:lang w:val="es-VE"/>
+        </w:rPr>
+        <w:t>User</w:t>
+      </w:r>
+      <w:proofErr w:type="spellEnd"/>
+      <w:r>
+        <w:rPr>
+          <w:rStyle w:val="VerbatimChar"/>
+          <w:lang w:val="es-VE"/>
+        </w:rPr>
+        <w:t xml:space="preserve"> porque los reportes son públicos/anónimos.</w:t>
+      </w:r>
+      <w:r>
+        <w:rPr>
+          <w:lang w:val="es-VE"/>
+        </w:rPr>
+        <w:br/>
+      </w:r>
+      <w:r>
+        <w:rPr>
+          <w:rStyle w:val="VerbatimChar"/>
+          <w:lang w:val="es-VE"/>
+        </w:rPr>
+        <w:t xml:space="preserve">Las fotos del animal irán en S3 usando el PK de Solicitud como parte del </w:t>
+      </w:r>
+      <w:proofErr w:type="spellStart"/>
+      <w:r>
+        <w:rPr>
+          <w:rStyle w:val="VerbatimChar"/>
+          <w:lang w:val="es-VE"/>
+        </w:rPr>
+        <w:t>path</w:t>
+      </w:r>
+      <w:proofErr w:type="spellEnd"/>
+      <w:r>
+        <w:rPr>
+          <w:rStyle w:val="VerbatimChar"/>
+          <w:lang w:val="es-VE"/>
+        </w:rPr>
+        <w:t>.</w:t>
+      </w:r>
+      <w:r>
+        <w:rPr>
+          <w:lang w:val="es-VE"/>
+        </w:rPr>
+        <w:br/>
+      </w:r>
+      <w:proofErr w:type="spellStart"/>
+      <w:r>
+        <w:rPr>
+          <w:rStyle w:val="VerbatimChar"/>
+          <w:lang w:val="es-VE"/>
+        </w:rPr>
+        <w:t>RevisionVeterinaria</w:t>
+      </w:r>
+      <w:proofErr w:type="spellEnd"/>
+      <w:r>
+        <w:rPr>
+          <w:rStyle w:val="VerbatimChar"/>
+          <w:lang w:val="es-VE"/>
+        </w:rPr>
+        <w:t xml:space="preserve"> está relacionada con Animal y con </w:t>
+      </w:r>
+      <w:proofErr w:type="spellStart"/>
+      <w:r>
+        <w:rPr>
+          <w:rStyle w:val="VerbatimChar"/>
+          <w:lang w:val="es-VE"/>
+        </w:rPr>
+        <w:t>User</w:t>
+      </w:r>
+      <w:proofErr w:type="spellEnd"/>
+      <w:r>
+        <w:rPr>
+          <w:rStyle w:val="VerbatimChar"/>
+          <w:lang w:val="es-VE"/>
+        </w:rPr>
+        <w:t xml:space="preserve">, donde </w:t>
+      </w:r>
+      <w:proofErr w:type="spellStart"/>
+      <w:r>
+        <w:rPr>
+          <w:rStyle w:val="VerbatimChar"/>
+          <w:lang w:val="es-VE"/>
+        </w:rPr>
+        <w:t>User</w:t>
+      </w:r>
+      <w:proofErr w:type="spellEnd"/>
+      <w:r>
+        <w:rPr>
+          <w:rStyle w:val="VerbatimChar"/>
+          <w:lang w:val="es-VE"/>
+        </w:rPr>
+        <w:t xml:space="preserve"> representa al veterinario que revisa.</w:t>
       </w:r>
     </w:p>
     <w:p>
       <w:pPr>
         <w:pStyle w:val="Heading2"/>
+        <w:rPr>
+          <w:lang w:val="es-VE"/>
+        </w:rPr>
       </w:pPr>
       <w:bookmarkStart w:id="15" w:name="prioridad-de-trabajo"/>
       <w:bookmarkEnd w:id="14"/>
       <w:r>
+        <w:rPr>
+          <w:lang w:val="es-VE"/>
+        </w:rPr>
         <w:lastRenderedPageBreak/>
         <w:t>10. Prioridad de trabajo</w:t>
       </w:r>
@@ -2023,8 +3347,14 @@
     <w:p>
       <w:pPr>
         <w:pStyle w:val="FirstParagraph"/>
-      </w:pPr>
-      <w:r>
+        <w:rPr>
+          <w:lang w:val="es-VE"/>
+        </w:rPr>
+      </w:pPr>
+      <w:r>
+        <w:rPr>
+          <w:lang w:val="es-VE"/>
+        </w:rPr>
         <w:t>Prioridad recomendada:</w:t>
       </w:r>
     </w:p>
@@ -2069,35 +3399,15 @@
         </w:numPr>
         <w:rPr>
           <w:rStyle w:val="VerbatimChar"/>
-        </w:rPr>
-      </w:pPr>
-      <w:proofErr w:type="spellStart"/>
-      <w:r>
-        <w:rPr>
-          <w:rStyle w:val="VerbatimChar"/>
-        </w:rPr>
-        <w:t>Identificar</w:t>
-      </w:r>
-      <w:proofErr w:type="spellEnd"/>
-      <w:r>
-        <w:rPr>
-          <w:rStyle w:val="VerbatimChar"/>
-        </w:rPr>
-        <w:t xml:space="preserve"> cada </w:t>
-      </w:r>
-      <w:proofErr w:type="spellStart"/>
-      <w:r>
-        <w:rPr>
-          <w:rStyle w:val="VerbatimChar"/>
-        </w:rPr>
-        <w:t>sección</w:t>
-      </w:r>
-      <w:proofErr w:type="spellEnd"/>
-      <w:r>
-        <w:rPr>
-          <w:rStyle w:val="VerbatimChar"/>
-        </w:rPr>
-        <w:t xml:space="preserve"> principal del HTML</w:t>
+          <w:lang w:val="es-VE"/>
+        </w:rPr>
+      </w:pPr>
+      <w:r>
+        <w:rPr>
+          <w:rStyle w:val="VerbatimChar"/>
+          <w:lang w:val="es-VE"/>
+        </w:rPr>
+        <w:t>Identificar cada sección principal del HTML</w:t>
       </w:r>
     </w:p>
     <w:p>
@@ -2301,34 +3611,32 @@
         </w:numPr>
         <w:rPr>
           <w:rStyle w:val="VerbatimChar"/>
-        </w:rPr>
-      </w:pPr>
-      <w:r>
-        <w:rPr>
-          <w:rStyle w:val="VerbatimChar"/>
-        </w:rPr>
-        <w:t xml:space="preserve">Registrar interceptor </w:t>
-      </w:r>
-      <w:proofErr w:type="spellStart"/>
-      <w:r>
-        <w:rPr>
-          <w:rStyle w:val="VerbatimChar"/>
-        </w:rPr>
-        <w:t>en</w:t>
-      </w:r>
-      <w:proofErr w:type="spellEnd"/>
-      <w:r>
-        <w:rPr>
-          <w:rStyle w:val="VerbatimChar"/>
-        </w:rPr>
-        <w:t xml:space="preserve"> </w:t>
-      </w:r>
-      <w:proofErr w:type="spellStart"/>
-      <w:r>
-        <w:rPr>
-          <w:rStyle w:val="VerbatimChar"/>
-        </w:rPr>
-        <w:t>app.config.ts</w:t>
+          <w:lang w:val="es-VE"/>
+        </w:rPr>
+      </w:pPr>
+      <w:r>
+        <w:rPr>
+          <w:rStyle w:val="VerbatimChar"/>
+          <w:lang w:val="es-VE"/>
+        </w:rPr>
+        <w:t xml:space="preserve">Registrar interceptor en </w:t>
+      </w:r>
+      <w:proofErr w:type="spellStart"/>
+      <w:proofErr w:type="gramStart"/>
+      <w:r>
+        <w:rPr>
+          <w:rStyle w:val="VerbatimChar"/>
+          <w:lang w:val="es-VE"/>
+        </w:rPr>
+        <w:t>app</w:t>
+      </w:r>
+      <w:proofErr w:type="gramEnd"/>
+      <w:r>
+        <w:rPr>
+          <w:rStyle w:val="VerbatimChar"/>
+          <w:lang w:val="es-VE"/>
+        </w:rPr>
+        <w:t>.config.ts</w:t>
       </w:r>
       <w:proofErr w:type="spellEnd"/>
     </w:p>
@@ -2341,21 +3649,15 @@
         </w:numPr>
         <w:rPr>
           <w:rStyle w:val="VerbatimChar"/>
-        </w:rPr>
-      </w:pPr>
-      <w:proofErr w:type="spellStart"/>
-      <w:r>
-        <w:rPr>
-          <w:rStyle w:val="VerbatimChar"/>
-        </w:rPr>
-        <w:t>Ejecutar</w:t>
-      </w:r>
-      <w:proofErr w:type="spellEnd"/>
-      <w:r>
-        <w:rPr>
-          <w:rStyle w:val="VerbatimChar"/>
-        </w:rPr>
-        <w:t xml:space="preserve"> ng serve y validar </w:t>
+          <w:lang w:val="es-VE"/>
+        </w:rPr>
+      </w:pPr>
+      <w:r>
+        <w:rPr>
+          <w:rStyle w:val="VerbatimChar"/>
+          <w:lang w:val="es-VE"/>
+        </w:rPr>
+        <w:t xml:space="preserve">Ejecutar ng serve y validar </w:t>
       </w:r>
       <w:hyperlink r:id="rId6" w:history="1">
         <w:r>
@@ -2363,6 +3665,7 @@
             <w:rStyle w:val="Hyperlink"/>
             <w:rFonts w:ascii="Consolas" w:hAnsi="Consolas"/>
             <w:sz w:val="22"/>
+            <w:lang w:val="es-VE"/>
           </w:rPr>
           <w:t>http://localhost:4200</w:t>
         </w:r>
@@ -2377,86 +3680,16 @@
         </w:numPr>
         <w:rPr>
           <w:rStyle w:val="VerbatimChar"/>
-        </w:rPr>
-      </w:pPr>
-      <w:proofErr w:type="spellStart"/>
-      <w:r>
-        <w:rPr>
-          <w:rStyle w:val="VerbatimChar"/>
-        </w:rPr>
-        <w:t>Ajustar</w:t>
-      </w:r>
-      <w:proofErr w:type="spellEnd"/>
-      <w:r>
-        <w:rPr>
-          <w:rStyle w:val="VerbatimChar"/>
-        </w:rPr>
-        <w:t xml:space="preserve"> </w:t>
-      </w:r>
-      <w:proofErr w:type="spellStart"/>
-      <w:r>
-        <w:rPr>
-          <w:rStyle w:val="VerbatimChar"/>
-        </w:rPr>
-        <w:t>visualmente</w:t>
-      </w:r>
-      <w:proofErr w:type="spellEnd"/>
-      <w:r>
-        <w:rPr>
-          <w:rStyle w:val="VerbatimChar"/>
-        </w:rPr>
-        <w:t xml:space="preserve"> </w:t>
-      </w:r>
-      <w:proofErr w:type="spellStart"/>
-      <w:r>
-        <w:rPr>
-          <w:rStyle w:val="VerbatimChar"/>
-        </w:rPr>
-        <w:t>cualquier</w:t>
-      </w:r>
-      <w:proofErr w:type="spellEnd"/>
-      <w:r>
-        <w:rPr>
-          <w:rStyle w:val="VerbatimChar"/>
-        </w:rPr>
-        <w:t xml:space="preserve"> </w:t>
-      </w:r>
-      <w:proofErr w:type="spellStart"/>
-      <w:r>
-        <w:rPr>
-          <w:rStyle w:val="VerbatimChar"/>
-        </w:rPr>
-        <w:t>diferencia</w:t>
-      </w:r>
-      <w:proofErr w:type="spellEnd"/>
-      <w:r>
-        <w:rPr>
-          <w:rStyle w:val="VerbatimChar"/>
-        </w:rPr>
-        <w:t xml:space="preserve"> con </w:t>
-      </w:r>
-      <w:proofErr w:type="spellStart"/>
-      <w:r>
-        <w:rPr>
-          <w:rStyle w:val="VerbatimChar"/>
-        </w:rPr>
-        <w:t>el</w:t>
-      </w:r>
-      <w:proofErr w:type="spellEnd"/>
-      <w:r>
-        <w:rPr>
-          <w:rStyle w:val="VerbatimChar"/>
-        </w:rPr>
-        <w:t xml:space="preserve"> </w:t>
-      </w:r>
-      <w:proofErr w:type="spellStart"/>
-      <w:r>
-        <w:rPr>
-          <w:rStyle w:val="VerbatimChar"/>
-        </w:rPr>
-        <w:t>prototipo</w:t>
-      </w:r>
-      <w:proofErr w:type="spellEnd"/>
+          <w:lang w:val="es-VE"/>
+        </w:rPr>
+      </w:pPr>
+      <w:r>
+        <w:rPr>
+          <w:rStyle w:val="VerbatimChar"/>
+          <w:lang w:val="es-VE"/>
+        </w:rPr>
+        <w:t>Ajustar visualmente cualquier diferencia con el prototipo</w:t>
+      </w:r>
     </w:p>
     <w:p>
       <w:pPr>
@@ -2578,99 +3811,179 @@
     <w:p>
       <w:pPr>
         <w:pStyle w:val="FirstParagraph"/>
-      </w:pPr>
-      <w:r>
+        <w:rPr>
+          <w:lang w:val="es-VE"/>
+        </w:rPr>
+      </w:pPr>
+      <w:r>
+        <w:rPr>
+          <w:lang w:val="es-VE"/>
+        </w:rPr>
         <w:t>El trabajo se considera completo cuando:</w:t>
       </w:r>
     </w:p>
     <w:p>
       <w:pPr>
         <w:pStyle w:val="SourceCode"/>
-      </w:pPr>
-      <w:r>
-        <w:rPr>
-          <w:rStyle w:val="VerbatimChar"/>
-        </w:rPr>
-        <w:t>El Angular app compila sin errores</w:t>
-      </w:r>
-      <w:r>
-        <w:br/>
-      </w:r>
-      <w:r>
-        <w:rPr>
-          <w:rStyle w:val="VerbatimChar"/>
+        <w:rPr>
+          <w:lang w:val="es-VE"/>
+        </w:rPr>
+      </w:pPr>
+      <w:r>
+        <w:rPr>
+          <w:rStyle w:val="VerbatimChar"/>
+          <w:lang w:val="es-VE"/>
+        </w:rPr>
+        <w:t xml:space="preserve">El Angular </w:t>
+      </w:r>
+      <w:proofErr w:type="gramStart"/>
+      <w:r>
+        <w:rPr>
+          <w:rStyle w:val="VerbatimChar"/>
+          <w:lang w:val="es-VE"/>
+        </w:rPr>
+        <w:t>app</w:t>
+      </w:r>
+      <w:proofErr w:type="gramEnd"/>
+      <w:r>
+        <w:rPr>
+          <w:rStyle w:val="VerbatimChar"/>
+          <w:lang w:val="es-VE"/>
+        </w:rPr>
+        <w:t xml:space="preserve"> compila sin errores</w:t>
+      </w:r>
+      <w:r>
+        <w:rPr>
+          <w:lang w:val="es-VE"/>
+        </w:rPr>
+        <w:br/>
+      </w:r>
+      <w:r>
+        <w:rPr>
+          <w:rStyle w:val="VerbatimChar"/>
+          <w:lang w:val="es-VE"/>
         </w:rPr>
         <w:t>ng serve funciona correctamente</w:t>
       </w:r>
       <w:r>
-        <w:br/>
-      </w:r>
-      <w:r>
-        <w:rPr>
-          <w:rStyle w:val="VerbatimChar"/>
+        <w:rPr>
+          <w:lang w:val="es-VE"/>
+        </w:rPr>
+        <w:br/>
+      </w:r>
+      <w:r>
+        <w:rPr>
+          <w:rStyle w:val="VerbatimChar"/>
+          <w:lang w:val="es-VE"/>
         </w:rPr>
         <w:t>http://localhost:4200 abre el sitio</w:t>
       </w:r>
       <w:r>
-        <w:br/>
-      </w:r>
-      <w:r>
-        <w:rPr>
-          <w:rStyle w:val="VerbatimChar"/>
+        <w:rPr>
+          <w:lang w:val="es-VE"/>
+        </w:rPr>
+        <w:br/>
+      </w:r>
+      <w:r>
+        <w:rPr>
+          <w:rStyle w:val="VerbatimChar"/>
+          <w:lang w:val="es-VE"/>
         </w:rPr>
         <w:t>El home muestra contenido del prototipo</w:t>
       </w:r>
       <w:r>
-        <w:br/>
-      </w:r>
-      <w:r>
-        <w:rPr>
-          <w:rStyle w:val="VerbatimChar"/>
+        <w:rPr>
+          <w:lang w:val="es-VE"/>
+        </w:rPr>
+        <w:br/>
+      </w:r>
+      <w:r>
+        <w:rPr>
+          <w:rStyle w:val="VerbatimChar"/>
+          <w:lang w:val="es-VE"/>
         </w:rPr>
         <w:t>Las secciones principales ya no están vacías</w:t>
       </w:r>
       <w:r>
-        <w:br/>
-      </w:r>
-      <w:r>
-        <w:rPr>
-          <w:rStyle w:val="VerbatimChar"/>
+        <w:rPr>
+          <w:lang w:val="es-VE"/>
+        </w:rPr>
+        <w:br/>
+      </w:r>
+      <w:r>
+        <w:rPr>
+          <w:rStyle w:val="VerbatimChar"/>
+          <w:lang w:val="es-VE"/>
         </w:rPr>
         <w:t>El menú navega entre las vistas</w:t>
       </w:r>
       <w:r>
-        <w:br/>
-      </w:r>
-      <w:r>
-        <w:rPr>
-          <w:rStyle w:val="VerbatimChar"/>
+        <w:rPr>
+          <w:lang w:val="es-VE"/>
+        </w:rPr>
+        <w:br/>
+      </w:r>
+      <w:r>
+        <w:rPr>
+          <w:rStyle w:val="VerbatimChar"/>
+          <w:lang w:val="es-VE"/>
         </w:rPr>
         <w:t>Los formularios visualmente existen</w:t>
       </w:r>
       <w:r>
-        <w:br/>
-      </w:r>
-      <w:r>
-        <w:rPr>
-          <w:rStyle w:val="VerbatimChar"/>
+        <w:rPr>
+          <w:lang w:val="es-VE"/>
+        </w:rPr>
+        <w:br/>
+      </w:r>
+      <w:r>
+        <w:rPr>
+          <w:rStyle w:val="VerbatimChar"/>
+          <w:lang w:val="es-VE"/>
         </w:rPr>
         <w:t>El panel veterinario existe visualmente</w:t>
       </w:r>
       <w:r>
-        <w:br/>
-      </w:r>
-      <w:r>
-        <w:rPr>
-          <w:rStyle w:val="VerbatimChar"/>
-        </w:rPr>
-        <w:t>El interceptor está registrado en app.config.ts</w:t>
-      </w:r>
-      <w:r>
-        <w:br/>
-      </w:r>
-      <w:r>
-        <w:rPr>
-          <w:rStyle w:val="VerbatimChar"/>
+        <w:rPr>
+          <w:lang w:val="es-VE"/>
+        </w:rPr>
+        <w:br/>
+      </w:r>
+      <w:r>
+        <w:rPr>
+          <w:rStyle w:val="VerbatimChar"/>
+          <w:lang w:val="es-VE"/>
+        </w:rPr>
+        <w:t xml:space="preserve">El interceptor está registrado en </w:t>
+      </w:r>
+      <w:proofErr w:type="spellStart"/>
+      <w:proofErr w:type="gramStart"/>
+      <w:r>
+        <w:rPr>
+          <w:rStyle w:val="VerbatimChar"/>
+          <w:lang w:val="es-VE"/>
+        </w:rPr>
+        <w:t>app</w:t>
+      </w:r>
+      <w:proofErr w:type="gramEnd"/>
+      <w:r>
+        <w:rPr>
+          <w:rStyle w:val="VerbatimChar"/>
+          <w:lang w:val="es-VE"/>
+        </w:rPr>
+        <w:t>.config.ts</w:t>
+      </w:r>
+      <w:proofErr w:type="spellEnd"/>
+      <w:r>
+        <w:rPr>
+          <w:lang w:val="es-VE"/>
+        </w:rPr>
+        <w:br/>
+      </w:r>
+      <w:r>
+        <w:rPr>
+          <w:rStyle w:val="VerbatimChar"/>
+          <w:lang w:val="es-VE"/>
         </w:rPr>
         <w:t>El diseño usa los SCSS ya copiados</w:t>
       </w:r>
@@ -2678,18 +3991,30 @@
     <w:p>
       <w:pPr>
         <w:pStyle w:val="Heading2"/>
+        <w:rPr>
+          <w:lang w:val="es-VE"/>
+        </w:rPr>
       </w:pPr>
       <w:bookmarkStart w:id="17" w:name="comandos-básicos"/>
       <w:bookmarkEnd w:id="16"/>
       <w:r>
+        <w:rPr>
+          <w:lang w:val="es-VE"/>
+        </w:rPr>
         <w:t>12. Comandos básicos</w:t>
       </w:r>
     </w:p>
     <w:p>
       <w:pPr>
         <w:pStyle w:val="FirstParagraph"/>
-      </w:pPr>
-      <w:r>
+        <w:rPr>
+          <w:lang w:val="es-VE"/>
+        </w:rPr>
+      </w:pPr>
+      <w:r>
+        <w:rPr>
+          <w:lang w:val="es-VE"/>
+        </w:rPr>
         <w:t>Desde la carpeta del proyecto Angular:</w:t>
       </w:r>
     </w:p>
@@ -2707,17 +4032,41 @@
         <w:rPr>
           <w:rStyle w:val="NormalTok"/>
         </w:rPr>
-        <w:t xml:space="preserve"> VetsPorVzla/FE/vetsporvzla</w:t>
-      </w:r>
-      <w:r>
-        <w:br/>
-      </w:r>
+        <w:t xml:space="preserve"> </w:t>
+      </w:r>
+      <w:proofErr w:type="spellStart"/>
+      <w:r>
+        <w:rPr>
+          <w:rStyle w:val="NormalTok"/>
+        </w:rPr>
+        <w:t>VetsPorVzla</w:t>
+      </w:r>
+      <w:proofErr w:type="spellEnd"/>
+      <w:r>
+        <w:rPr>
+          <w:rStyle w:val="NormalTok"/>
+        </w:rPr>
+        <w:t>/FE/</w:t>
+      </w:r>
+      <w:proofErr w:type="spellStart"/>
+      <w:r>
+        <w:rPr>
+          <w:rStyle w:val="NormalTok"/>
+        </w:rPr>
+        <w:t>vetsporvzla</w:t>
+      </w:r>
+      <w:proofErr w:type="spellEnd"/>
+      <w:r>
+        <w:br/>
+      </w:r>
+      <w:proofErr w:type="spellStart"/>
       <w:r>
         <w:rPr>
           <w:rStyle w:val="ExtensionTok"/>
         </w:rPr>
         <w:t>npm</w:t>
       </w:r>
+      <w:proofErr w:type="spellEnd"/>
       <w:r>
         <w:rPr>
           <w:rStyle w:val="NormalTok"/>
@@ -2737,8 +4086,16 @@
         <w:rPr>
           <w:rStyle w:val="NormalTok"/>
         </w:rPr>
-        <w:t xml:space="preserve"> serve</w:t>
-      </w:r>
+        <w:t xml:space="preserve"> </w:t>
+      </w:r>
+      <w:proofErr w:type="gramStart"/>
+      <w:r>
+        <w:rPr>
+          <w:rStyle w:val="NormalTok"/>
+        </w:rPr>
+        <w:t>serve</w:t>
+      </w:r>
+      <w:proofErr w:type="gramEnd"/>
     </w:p>
     <w:p>
       <w:pPr>
@@ -2773,12 +4130,315 @@
     <w:p>
       <w:pPr>
         <w:pStyle w:val="FirstParagraph"/>
-      </w:pPr>
-      <w:r>
-        <w:t>La prioridad no es rehacer el diseño, sino convertir el prototipo HTML existente en templates Angular y dejar el FE listo para conectar con servicios/API posteriormente.</w:t>
+        <w:rPr>
+          <w:lang w:val="es-VE"/>
+        </w:rPr>
+      </w:pPr>
+      <w:r>
+        <w:rPr>
+          <w:lang w:val="es-VE"/>
+        </w:rPr>
+        <w:t xml:space="preserve">La prioridad no es rehacer el diseño, sino convertir el prototipo HTML existente en </w:t>
+      </w:r>
+      <w:proofErr w:type="spellStart"/>
+      <w:r>
+        <w:rPr>
+          <w:lang w:val="es-VE"/>
+        </w:rPr>
+        <w:t>templates</w:t>
+      </w:r>
+      <w:proofErr w:type="spellEnd"/>
+      <w:r>
+        <w:rPr>
+          <w:lang w:val="es-VE"/>
+        </w:rPr>
+        <w:t xml:space="preserve"> Angular y dejar el FE listo para conectar con servicios/API posteriormente.</w:t>
       </w:r>
       <w:bookmarkEnd w:id="0"/>
       <w:bookmarkEnd w:id="18"/>
+    </w:p>
+    <w:p>
+      <w:pPr>
+        <w:pStyle w:val="BodyText"/>
+        <w:rPr>
+          <w:lang w:val="es-VE"/>
+        </w:rPr>
+      </w:pPr>
+    </w:p>
+    <w:p>
+      <w:pPr>
+        <w:pStyle w:val="BodyText"/>
+        <w:rPr>
+          <w:lang w:val="es-VE"/>
+        </w:rPr>
+      </w:pPr>
+      <w:proofErr w:type="gramStart"/>
+      <w:r>
+        <w:rPr>
+          <w:lang w:val="es-VE"/>
+        </w:rPr>
+        <w:t>Notas  -</w:t>
+      </w:r>
+      <w:proofErr w:type="gramEnd"/>
+      <w:r>
+        <w:rPr>
+          <w:lang w:val="es-VE"/>
+        </w:rPr>
+        <w:t xml:space="preserve"> 06/27/2026</w:t>
+      </w:r>
+    </w:p>
+    <w:p>
+      <w:pPr>
+        <w:pStyle w:val="BodyText"/>
+        <w:rPr>
+          <w:lang w:val="es-VE"/>
+        </w:rPr>
+      </w:pPr>
+      <w:r>
+        <w:rPr>
+          <w:lang w:val="es-VE"/>
+        </w:rPr>
+        <w:t>Tareas Completadas:</w:t>
+      </w:r>
+    </w:p>
+    <w:p>
+      <w:pPr>
+        <w:pStyle w:val="BodyText"/>
+        <w:numPr>
+          <w:ilvl w:val="0"/>
+          <w:numId w:val="2"/>
+        </w:numPr>
+        <w:rPr>
+          <w:lang w:val="es-VE"/>
+        </w:rPr>
+      </w:pPr>
+      <w:r>
+        <w:rPr>
+          <w:lang w:val="es-VE"/>
+        </w:rPr>
+        <w:t xml:space="preserve">CRUD </w:t>
+      </w:r>
+      <w:proofErr w:type="spellStart"/>
+      <w:r>
+        <w:rPr>
+          <w:lang w:val="es-VE"/>
+        </w:rPr>
+        <w:t>Stored</w:t>
+      </w:r>
+      <w:proofErr w:type="spellEnd"/>
+      <w:r>
+        <w:rPr>
+          <w:lang w:val="es-VE"/>
+        </w:rPr>
+        <w:t xml:space="preserve"> </w:t>
+      </w:r>
+      <w:proofErr w:type="spellStart"/>
+      <w:r>
+        <w:rPr>
+          <w:lang w:val="es-VE"/>
+        </w:rPr>
+        <w:t>Procedures</w:t>
+      </w:r>
+      <w:proofErr w:type="spellEnd"/>
+    </w:p>
+    <w:p>
+      <w:pPr>
+        <w:pStyle w:val="BodyText"/>
+        <w:numPr>
+          <w:ilvl w:val="0"/>
+          <w:numId w:val="2"/>
+        </w:numPr>
+        <w:rPr>
+          <w:lang w:val="es-VE"/>
+        </w:rPr>
+      </w:pPr>
+      <w:r>
+        <w:rPr>
+          <w:lang w:val="es-VE"/>
+        </w:rPr>
+        <w:t>CRUD Rest API</w:t>
+      </w:r>
+    </w:p>
+    <w:p>
+      <w:pPr>
+        <w:pStyle w:val="BodyText"/>
+        <w:numPr>
+          <w:ilvl w:val="0"/>
+          <w:numId w:val="2"/>
+        </w:numPr>
+        <w:rPr>
+          <w:lang w:val="es-VE"/>
+        </w:rPr>
+      </w:pPr>
+      <w:r>
+        <w:rPr>
+          <w:lang w:val="es-VE"/>
+        </w:rPr>
+        <w:t>Front End Up</w:t>
+      </w:r>
+    </w:p>
+    <w:p>
+      <w:pPr>
+        <w:pStyle w:val="BodyText"/>
+        <w:numPr>
+          <w:ilvl w:val="0"/>
+          <w:numId w:val="2"/>
+        </w:numPr>
+      </w:pPr>
+      <w:r>
+        <w:t xml:space="preserve">Front End Integration with </w:t>
+      </w:r>
+      <w:proofErr w:type="spellStart"/>
+      <w:r>
+        <w:t>R</w:t>
+      </w:r>
+      <w:r>
+        <w:t>eportar</w:t>
+      </w:r>
+      <w:proofErr w:type="spellEnd"/>
+      <w:r>
+        <w:t xml:space="preserve"> </w:t>
+      </w:r>
+      <w:proofErr w:type="spellStart"/>
+      <w:r>
+        <w:t>Mascota</w:t>
+      </w:r>
+      <w:proofErr w:type="spellEnd"/>
+    </w:p>
+    <w:p>
+      <w:pPr>
+        <w:pStyle w:val="BodyText"/>
+      </w:pPr>
+      <w:proofErr w:type="spellStart"/>
+      <w:r>
+        <w:t>Comentarios</w:t>
+      </w:r>
+      <w:proofErr w:type="spellEnd"/>
+      <w:r>
+        <w:t>:</w:t>
+      </w:r>
+    </w:p>
+    <w:p>
+      <w:pPr>
+        <w:pStyle w:val="BodyText"/>
+        <w:numPr>
+          <w:ilvl w:val="0"/>
+          <w:numId w:val="2"/>
+        </w:numPr>
+        <w:rPr>
+          <w:lang w:val="es-VE"/>
+        </w:rPr>
+      </w:pPr>
+      <w:r>
+        <w:rPr>
+          <w:lang w:val="es-VE"/>
+        </w:rPr>
+        <w:t>Me parece la base d</w:t>
+      </w:r>
+      <w:r>
+        <w:rPr>
+          <w:lang w:val="es-VE"/>
+        </w:rPr>
+        <w:t xml:space="preserve">e datos </w:t>
+      </w:r>
+      <w:proofErr w:type="spellStart"/>
+      <w:r>
+        <w:rPr>
+          <w:lang w:val="es-VE"/>
+        </w:rPr>
+        <w:t>esta</w:t>
+      </w:r>
+      <w:proofErr w:type="spellEnd"/>
+      <w:r>
+        <w:rPr>
+          <w:lang w:val="es-VE"/>
+        </w:rPr>
+        <w:t xml:space="preserve"> muy compleja, debería ser mas sencilla para poder sacar el proyecto rápido</w:t>
+      </w:r>
+    </w:p>
+    <w:p>
+      <w:pPr>
+        <w:pStyle w:val="BodyText"/>
+        <w:numPr>
+          <w:ilvl w:val="0"/>
+          <w:numId w:val="2"/>
+        </w:numPr>
+        <w:rPr>
+          <w:lang w:val="es-VE"/>
+        </w:rPr>
+      </w:pPr>
+      <w:r>
+        <w:rPr>
+          <w:lang w:val="es-VE"/>
+        </w:rPr>
+        <w:t>Me parece que el menú debería ser desarrollado parte por parte, para que puedas liberar rápido el uso del portal, sino va a tomar mucho mas tiempo de lo que debería para la emergencia</w:t>
+      </w:r>
+    </w:p>
+    <w:p>
+      <w:pPr>
+        <w:pStyle w:val="BodyText"/>
+        <w:numPr>
+          <w:ilvl w:val="0"/>
+          <w:numId w:val="2"/>
+        </w:numPr>
+        <w:rPr>
+          <w:lang w:val="es-VE"/>
+        </w:rPr>
+      </w:pPr>
+      <w:r>
+        <w:rPr>
+          <w:lang w:val="es-VE"/>
+        </w:rPr>
+        <w:t>Frontend</w:t>
+      </w:r>
+      <w:r>
+        <w:rPr>
+          <w:lang w:val="es-VE"/>
+        </w:rPr>
+        <w:t xml:space="preserve"> tiene el README</w:t>
+      </w:r>
+    </w:p>
+    <w:p>
+      <w:pPr>
+        <w:pStyle w:val="BodyText"/>
+        <w:numPr>
+          <w:ilvl w:val="0"/>
+          <w:numId w:val="2"/>
+        </w:numPr>
+        <w:rPr>
+          <w:lang w:val="es-VE"/>
+        </w:rPr>
+      </w:pPr>
+      <w:r>
+        <w:rPr>
+          <w:lang w:val="es-VE"/>
+        </w:rPr>
+        <w:t>Backend tiene el README</w:t>
+      </w:r>
+    </w:p>
+    <w:p>
+      <w:pPr>
+        <w:pStyle w:val="BodyText"/>
+        <w:rPr>
+          <w:lang w:val="es-VE"/>
+        </w:rPr>
+      </w:pPr>
+    </w:p>
+    <w:p>
+      <w:pPr>
+        <w:pStyle w:val="BodyText"/>
+        <w:rPr>
+          <w:lang w:val="es-VE"/>
+        </w:rPr>
+      </w:pPr>
+    </w:p>
+    <w:p>
+      <w:pPr>
+        <w:pStyle w:val="BodyText"/>
+        <w:rPr>
+          <w:lang w:val="es-VE"/>
+        </w:rPr>
+      </w:pPr>
     </w:p>
     <w:sectPr>
       <w:footnotePr>

</xml_diff>